<commit_message>
Add initial security lifecycle plan
</commit_message>
<xml_diff>
--- a/documentation/Security Lifecycle Plan.docx
+++ b/documentation/Security Lifecycle Plan.docx
@@ -191,55 +191,23 @@
           <w:szCs w:val="24"/>
         </w:rPr>
         <w:br/>
-        <w:t xml:space="preserve">A privileged </w:t>
-      </w:r>
-      <w:proofErr w:type="gramStart"/>
-      <w:r>
-        <w:rPr>
-          <w:rFonts w:cs="Times New Roman"/>
-          <w:szCs w:val="24"/>
-        </w:rPr>
-        <w:t>user</w:t>
-      </w:r>
-      <w:proofErr w:type="gramEnd"/>
-      <w:r>
-        <w:rPr>
-          <w:rFonts w:cs="Times New Roman"/>
-          <w:szCs w:val="24"/>
-        </w:rPr>
-        <w:t xml:space="preserve"> who can perform restricted administrative operations in addition to normal authorized functionality.</w:t>
-      </w:r>
-    </w:p>
-    <w:p>
-      <w:pPr>
-        <w:spacing w:line="360" w:lineRule="auto"/>
-        <w:rPr>
-          <w:rFonts w:cs="Times New Roman"/>
-          <w:szCs w:val="24"/>
-        </w:rPr>
-      </w:pPr>
-      <w:r>
-        <w:rPr>
-          <w:rFonts w:cs="Times New Roman"/>
-          <w:szCs w:val="24"/>
-        </w:rPr>
-        <w:t xml:space="preserve">Three accounts will be </w:t>
-      </w:r>
-      <w:proofErr w:type="gramStart"/>
-      <w:r>
-        <w:rPr>
-          <w:rFonts w:cs="Times New Roman"/>
-          <w:szCs w:val="24"/>
-        </w:rPr>
-        <w:t>seeded</w:t>
-      </w:r>
-      <w:proofErr w:type="gramEnd"/>
-      <w:r>
-        <w:rPr>
-          <w:rFonts w:cs="Times New Roman"/>
-          <w:szCs w:val="24"/>
-        </w:rPr>
-        <w:t>:</w:t>
+        <w:t>A privileged user who can perform restricted administrative operations in addition to normal authorized functionality.</w:t>
+      </w:r>
+    </w:p>
+    <w:p>
+      <w:pPr>
+        <w:spacing w:line="360" w:lineRule="auto"/>
+        <w:rPr>
+          <w:rFonts w:cs="Times New Roman"/>
+          <w:szCs w:val="24"/>
+        </w:rPr>
+      </w:pPr>
+      <w:r>
+        <w:rPr>
+          <w:rFonts w:cs="Times New Roman"/>
+          <w:szCs w:val="24"/>
+        </w:rPr>
+        <w:t>Three accounts will be seeded:</w:t>
       </w:r>
     </w:p>
     <w:p>
@@ -1710,72 +1678,2704 @@
           <w:rFonts w:cs="Times New Roman"/>
           <w:szCs w:val="24"/>
         </w:rPr>
-        <w:t xml:space="preserve">For each vulnerability, the project will document the violated security assumption, vulnerable </w:t>
+        <w:t>For each vulnerability, the project will document the violated security assumption, vulnerable behaviour, conditions required to demonstrate the vulnerability, security impact, and implemented mitigation.</w:t>
+      </w:r>
+    </w:p>
+    <w:p>
+      <w:pPr>
+        <w:spacing w:line="360" w:lineRule="auto"/>
+        <w:rPr>
+          <w:rFonts w:cs="Times New Roman"/>
+          <w:szCs w:val="24"/>
+        </w:rPr>
+      </w:pPr>
+      <w:r>
+        <w:rPr>
+          <w:rFonts w:cs="Times New Roman"/>
+          <w:szCs w:val="24"/>
+        </w:rPr>
+        <w:t>Where appropriate, automated tests will provide evidence of both the vulnerable behaviour and the corrected implementation.</w:t>
+      </w:r>
+    </w:p>
+    <w:p>
+      <w:pPr>
+        <w:spacing w:line="360" w:lineRule="auto"/>
+        <w:rPr>
+          <w:rFonts w:cs="Times New Roman"/>
+          <w:szCs w:val="24"/>
+        </w:rPr>
+      </w:pPr>
+      <w:r>
+        <w:rPr>
+          <w:rFonts w:cs="Times New Roman"/>
+          <w:szCs w:val="24"/>
+        </w:rPr>
+        <w:t>All vulnerability demonstrations will be limited to the local application, seeded accounts, and synthetic booking data created for this assignment.</w:t>
+      </w:r>
+    </w:p>
+    <w:p>
+      <w:pPr>
+        <w:rPr>
+          <w:rFonts w:cs="Times New Roman"/>
+          <w:szCs w:val="24"/>
+        </w:rPr>
+      </w:pPr>
+      <w:r>
+        <w:rPr>
+          <w:rFonts w:cs="Times New Roman"/>
+          <w:szCs w:val="24"/>
+        </w:rPr>
+        <w:br w:type="page"/>
+      </w:r>
+    </w:p>
+    <w:p>
+      <w:pPr>
+        <w:spacing w:line="360" w:lineRule="auto"/>
+        <w:rPr>
+          <w:rFonts w:cs="Times New Roman"/>
+          <w:b/>
+          <w:bCs/>
+          <w:szCs w:val="24"/>
+          <w:lang w:val="da-DK"/>
+        </w:rPr>
+      </w:pPr>
+      <w:r>
+        <w:rPr>
+          <w:rFonts w:cs="Times New Roman"/>
+          <w:b/>
+          <w:bCs/>
+          <w:szCs w:val="24"/>
+          <w:lang w:val="da-DK"/>
+        </w:rPr>
+        <w:lastRenderedPageBreak/>
+        <w:t>2. Operation List</w:t>
+      </w:r>
+    </w:p>
+    <w:p>
+      <w:pPr>
+        <w:spacing w:line="360" w:lineRule="auto"/>
+        <w:rPr>
+          <w:rFonts w:cs="Times New Roman"/>
+          <w:szCs w:val="24"/>
+          <w:lang w:val="da-DK"/>
+        </w:rPr>
+      </w:pPr>
+      <w:r>
+        <w:rPr>
+          <w:rFonts w:cs="Times New Roman"/>
+          <w:szCs w:val="24"/>
+          <w:lang w:val="da-DK"/>
+        </w:rPr>
+        <w:t xml:space="preserve">The </w:t>
       </w:r>
       <w:proofErr w:type="spellStart"/>
       <w:r>
         <w:rPr>
           <w:rFonts w:cs="Times New Roman"/>
           <w:szCs w:val="24"/>
-        </w:rPr>
-        <w:t>behaviour</w:t>
+          <w:lang w:val="da-DK"/>
+        </w:rPr>
+        <w:t>following</w:t>
       </w:r>
       <w:proofErr w:type="spellEnd"/>
       <w:r>
         <w:rPr>
           <w:rFonts w:cs="Times New Roman"/>
           <w:szCs w:val="24"/>
-        </w:rPr>
-        <w:t>, conditions required to demonstrate the vulnerability, security impact, and implemented mitigation.</w:t>
-      </w:r>
-    </w:p>
-    <w:p>
-      <w:pPr>
-        <w:spacing w:line="360" w:lineRule="auto"/>
-        <w:rPr>
-          <w:rFonts w:cs="Times New Roman"/>
-          <w:szCs w:val="24"/>
-        </w:rPr>
-      </w:pPr>
-      <w:r>
-        <w:rPr>
-          <w:rFonts w:cs="Times New Roman"/>
-          <w:szCs w:val="24"/>
-        </w:rPr>
-        <w:t xml:space="preserve">Where appropriate, automated tests will provide evidence of both the vulnerable </w:t>
+          <w:lang w:val="da-DK"/>
+        </w:rPr>
+        <w:t xml:space="preserve"> operations </w:t>
       </w:r>
       <w:proofErr w:type="spellStart"/>
       <w:r>
         <w:rPr>
           <w:rFonts w:cs="Times New Roman"/>
           <w:szCs w:val="24"/>
-        </w:rPr>
-        <w:t>behaviour</w:t>
+          <w:lang w:val="da-DK"/>
+        </w:rPr>
+        <w:t>define</w:t>
       </w:r>
       <w:proofErr w:type="spellEnd"/>
       <w:r>
         <w:rPr>
           <w:rFonts w:cs="Times New Roman"/>
           <w:szCs w:val="24"/>
-        </w:rPr>
-        <w:t xml:space="preserve"> and the corrected implementation.</w:t>
-      </w:r>
-    </w:p>
-    <w:p>
-      <w:pPr>
-        <w:spacing w:line="360" w:lineRule="auto"/>
-        <w:rPr>
-          <w:rFonts w:cs="Times New Roman"/>
-          <w:szCs w:val="24"/>
-        </w:rPr>
-      </w:pPr>
-      <w:r>
-        <w:rPr>
-          <w:rFonts w:cs="Times New Roman"/>
-          <w:szCs w:val="24"/>
-        </w:rPr>
-        <w:t>All vulnerability demonstrations will be limited to the local application, seeded accounts, and synthetic booking data created for this assignment.</w:t>
-      </w:r>
+          <w:lang w:val="da-DK"/>
+        </w:rPr>
+        <w:t xml:space="preserve"> the </w:t>
+      </w:r>
+      <w:proofErr w:type="spellStart"/>
+      <w:r>
+        <w:rPr>
+          <w:rFonts w:cs="Times New Roman"/>
+          <w:szCs w:val="24"/>
+          <w:lang w:val="da-DK"/>
+        </w:rPr>
+        <w:t>main</w:t>
+      </w:r>
+      <w:proofErr w:type="spellEnd"/>
+      <w:r>
+        <w:rPr>
+          <w:rFonts w:cs="Times New Roman"/>
+          <w:szCs w:val="24"/>
+          <w:lang w:val="da-DK"/>
+        </w:rPr>
+        <w:t xml:space="preserve"> </w:t>
+      </w:r>
+      <w:proofErr w:type="spellStart"/>
+      <w:r>
+        <w:rPr>
+          <w:rFonts w:cs="Times New Roman"/>
+          <w:szCs w:val="24"/>
+          <w:lang w:val="da-DK"/>
+        </w:rPr>
+        <w:t>functionality</w:t>
+      </w:r>
+      <w:proofErr w:type="spellEnd"/>
+      <w:r>
+        <w:rPr>
+          <w:rFonts w:cs="Times New Roman"/>
+          <w:szCs w:val="24"/>
+          <w:lang w:val="da-DK"/>
+        </w:rPr>
+        <w:t xml:space="preserve"> of the Booking Management System and </w:t>
+      </w:r>
+      <w:proofErr w:type="spellStart"/>
+      <w:r>
+        <w:rPr>
+          <w:rFonts w:cs="Times New Roman"/>
+          <w:szCs w:val="24"/>
+          <w:lang w:val="da-DK"/>
+        </w:rPr>
+        <w:t>identify</w:t>
+      </w:r>
+      <w:proofErr w:type="spellEnd"/>
+      <w:r>
+        <w:rPr>
+          <w:rFonts w:cs="Times New Roman"/>
+          <w:szCs w:val="24"/>
+          <w:lang w:val="da-DK"/>
+        </w:rPr>
+        <w:t xml:space="preserve"> the components </w:t>
+      </w:r>
+      <w:proofErr w:type="spellStart"/>
+      <w:r>
+        <w:rPr>
+          <w:rFonts w:cs="Times New Roman"/>
+          <w:szCs w:val="24"/>
+          <w:lang w:val="da-DK"/>
+        </w:rPr>
+        <w:t>involved</w:t>
+      </w:r>
+      <w:proofErr w:type="spellEnd"/>
+      <w:r>
+        <w:rPr>
+          <w:rFonts w:cs="Times New Roman"/>
+          <w:szCs w:val="24"/>
+          <w:lang w:val="da-DK"/>
+        </w:rPr>
+        <w:t xml:space="preserve"> in </w:t>
+      </w:r>
+      <w:proofErr w:type="spellStart"/>
+      <w:r>
+        <w:rPr>
+          <w:rFonts w:cs="Times New Roman"/>
+          <w:szCs w:val="24"/>
+          <w:lang w:val="da-DK"/>
+        </w:rPr>
+        <w:t>each</w:t>
+      </w:r>
+      <w:proofErr w:type="spellEnd"/>
+      <w:r>
+        <w:rPr>
+          <w:rFonts w:cs="Times New Roman"/>
+          <w:szCs w:val="24"/>
+          <w:lang w:val="da-DK"/>
+        </w:rPr>
+        <w:t xml:space="preserve"> operation.</w:t>
+      </w:r>
+    </w:p>
+    <w:tbl>
+      <w:tblPr>
+        <w:tblStyle w:val="Tabel-Gitter"/>
+        <w:tblW w:w="0" w:type="auto"/>
+        <w:tblLook w:val="04A0" w:firstRow="1" w:lastRow="0" w:firstColumn="1" w:lastColumn="0" w:noHBand="0" w:noVBand="1"/>
+      </w:tblPr>
+      <w:tblGrid>
+        <w:gridCol w:w="643"/>
+        <w:gridCol w:w="1505"/>
+        <w:gridCol w:w="970"/>
+        <w:gridCol w:w="2012"/>
+        <w:gridCol w:w="4498"/>
+      </w:tblGrid>
+      <w:tr>
+        <w:tc>
+          <w:tcPr>
+            <w:tcW w:w="0" w:type="auto"/>
+            <w:hideMark/>
+          </w:tcPr>
+          <w:p>
+            <w:pPr>
+              <w:spacing w:after="160" w:line="360" w:lineRule="auto"/>
+              <w:rPr>
+                <w:rFonts w:cs="Times New Roman"/>
+                <w:b/>
+                <w:bCs/>
+                <w:szCs w:val="24"/>
+                <w:lang w:val="da-DK"/>
+              </w:rPr>
+            </w:pPr>
+            <w:r>
+              <w:rPr>
+                <w:rFonts w:cs="Times New Roman"/>
+                <w:b/>
+                <w:bCs/>
+                <w:szCs w:val="24"/>
+                <w:lang w:val="da-DK"/>
+              </w:rPr>
+              <w:t>ID</w:t>
+            </w:r>
+          </w:p>
+        </w:tc>
+        <w:tc>
+          <w:tcPr>
+            <w:tcW w:w="0" w:type="auto"/>
+            <w:hideMark/>
+          </w:tcPr>
+          <w:p>
+            <w:pPr>
+              <w:spacing w:after="160" w:line="360" w:lineRule="auto"/>
+              <w:rPr>
+                <w:rFonts w:cs="Times New Roman"/>
+                <w:b/>
+                <w:bCs/>
+                <w:szCs w:val="24"/>
+                <w:lang w:val="da-DK"/>
+              </w:rPr>
+            </w:pPr>
+            <w:r>
+              <w:rPr>
+                <w:rFonts w:cs="Times New Roman"/>
+                <w:b/>
+                <w:bCs/>
+                <w:szCs w:val="24"/>
+                <w:lang w:val="da-DK"/>
+              </w:rPr>
+              <w:t>Operation</w:t>
+            </w:r>
+          </w:p>
+        </w:tc>
+        <w:tc>
+          <w:tcPr>
+            <w:tcW w:w="0" w:type="auto"/>
+            <w:hideMark/>
+          </w:tcPr>
+          <w:p>
+            <w:pPr>
+              <w:spacing w:after="160" w:line="360" w:lineRule="auto"/>
+              <w:rPr>
+                <w:rFonts w:cs="Times New Roman"/>
+                <w:b/>
+                <w:bCs/>
+                <w:szCs w:val="24"/>
+                <w:lang w:val="da-DK"/>
+              </w:rPr>
+            </w:pPr>
+            <w:proofErr w:type="spellStart"/>
+            <w:r>
+              <w:rPr>
+                <w:rFonts w:cs="Times New Roman"/>
+                <w:b/>
+                <w:bCs/>
+                <w:szCs w:val="24"/>
+                <w:lang w:val="da-DK"/>
+              </w:rPr>
+              <w:t>Actor</w:t>
+            </w:r>
+            <w:proofErr w:type="spellEnd"/>
+          </w:p>
+        </w:tc>
+        <w:tc>
+          <w:tcPr>
+            <w:tcW w:w="0" w:type="auto"/>
+            <w:hideMark/>
+          </w:tcPr>
+          <w:p>
+            <w:pPr>
+              <w:spacing w:after="160" w:line="360" w:lineRule="auto"/>
+              <w:rPr>
+                <w:rFonts w:cs="Times New Roman"/>
+                <w:b/>
+                <w:bCs/>
+                <w:szCs w:val="24"/>
+                <w:lang w:val="da-DK"/>
+              </w:rPr>
+            </w:pPr>
+            <w:r>
+              <w:rPr>
+                <w:rFonts w:cs="Times New Roman"/>
+                <w:b/>
+                <w:bCs/>
+                <w:szCs w:val="24"/>
+                <w:lang w:val="da-DK"/>
+              </w:rPr>
+              <w:t xml:space="preserve">Components </w:t>
+            </w:r>
+            <w:proofErr w:type="spellStart"/>
+            <w:r>
+              <w:rPr>
+                <w:rFonts w:cs="Times New Roman"/>
+                <w:b/>
+                <w:bCs/>
+                <w:szCs w:val="24"/>
+                <w:lang w:val="da-DK"/>
+              </w:rPr>
+              <w:t>Involved</w:t>
+            </w:r>
+            <w:proofErr w:type="spellEnd"/>
+          </w:p>
+        </w:tc>
+        <w:tc>
+          <w:tcPr>
+            <w:tcW w:w="0" w:type="auto"/>
+            <w:hideMark/>
+          </w:tcPr>
+          <w:p>
+            <w:pPr>
+              <w:spacing w:after="160" w:line="360" w:lineRule="auto"/>
+              <w:rPr>
+                <w:rFonts w:cs="Times New Roman"/>
+                <w:b/>
+                <w:bCs/>
+                <w:szCs w:val="24"/>
+                <w:lang w:val="da-DK"/>
+              </w:rPr>
+            </w:pPr>
+            <w:proofErr w:type="spellStart"/>
+            <w:r>
+              <w:rPr>
+                <w:rFonts w:cs="Times New Roman"/>
+                <w:b/>
+                <w:bCs/>
+                <w:szCs w:val="24"/>
+                <w:lang w:val="da-DK"/>
+              </w:rPr>
+              <w:t>Description</w:t>
+            </w:r>
+            <w:proofErr w:type="spellEnd"/>
+          </w:p>
+        </w:tc>
+      </w:tr>
+      <w:tr>
+        <w:tc>
+          <w:tcPr>
+            <w:tcW w:w="0" w:type="auto"/>
+            <w:hideMark/>
+          </w:tcPr>
+          <w:p>
+            <w:pPr>
+              <w:spacing w:after="160" w:line="360" w:lineRule="auto"/>
+              <w:rPr>
+                <w:rFonts w:cs="Times New Roman"/>
+                <w:szCs w:val="24"/>
+                <w:lang w:val="da-DK"/>
+              </w:rPr>
+            </w:pPr>
+            <w:r>
+              <w:rPr>
+                <w:rFonts w:cs="Times New Roman"/>
+                <w:szCs w:val="24"/>
+                <w:lang w:val="da-DK"/>
+              </w:rPr>
+              <w:t>OP1</w:t>
+            </w:r>
+          </w:p>
+        </w:tc>
+        <w:tc>
+          <w:tcPr>
+            <w:tcW w:w="0" w:type="auto"/>
+            <w:hideMark/>
+          </w:tcPr>
+          <w:p>
+            <w:pPr>
+              <w:spacing w:after="160" w:line="360" w:lineRule="auto"/>
+              <w:rPr>
+                <w:rFonts w:cs="Times New Roman"/>
+                <w:szCs w:val="24"/>
+                <w:lang w:val="da-DK"/>
+              </w:rPr>
+            </w:pPr>
+            <w:r>
+              <w:rPr>
+                <w:rFonts w:cs="Times New Roman"/>
+                <w:szCs w:val="24"/>
+                <w:lang w:val="da-DK"/>
+              </w:rPr>
+              <w:t>Login</w:t>
+            </w:r>
+          </w:p>
+        </w:tc>
+        <w:tc>
+          <w:tcPr>
+            <w:tcW w:w="0" w:type="auto"/>
+            <w:hideMark/>
+          </w:tcPr>
+          <w:p>
+            <w:pPr>
+              <w:spacing w:after="160" w:line="360" w:lineRule="auto"/>
+              <w:rPr>
+                <w:rFonts w:cs="Times New Roman"/>
+                <w:szCs w:val="24"/>
+                <w:lang w:val="da-DK"/>
+              </w:rPr>
+            </w:pPr>
+            <w:r>
+              <w:rPr>
+                <w:rFonts w:cs="Times New Roman"/>
+                <w:szCs w:val="24"/>
+                <w:lang w:val="da-DK"/>
+              </w:rPr>
+              <w:t xml:space="preserve">User / </w:t>
+            </w:r>
+            <w:proofErr w:type="spellStart"/>
+            <w:r>
+              <w:rPr>
+                <w:rFonts w:cs="Times New Roman"/>
+                <w:szCs w:val="24"/>
+                <w:lang w:val="da-DK"/>
+              </w:rPr>
+              <w:t>Admin</w:t>
+            </w:r>
+            <w:proofErr w:type="spellEnd"/>
+          </w:p>
+        </w:tc>
+        <w:tc>
+          <w:tcPr>
+            <w:tcW w:w="0" w:type="auto"/>
+            <w:hideMark/>
+          </w:tcPr>
+          <w:p>
+            <w:pPr>
+              <w:spacing w:after="160" w:line="360" w:lineRule="auto"/>
+              <w:rPr>
+                <w:rFonts w:cs="Times New Roman"/>
+                <w:szCs w:val="24"/>
+                <w:lang w:val="da-DK"/>
+              </w:rPr>
+            </w:pPr>
+            <w:r>
+              <w:rPr>
+                <w:rFonts w:cs="Times New Roman"/>
+                <w:szCs w:val="24"/>
+                <w:lang w:val="da-DK"/>
+              </w:rPr>
+              <w:t>API Service</w:t>
+            </w:r>
+          </w:p>
+        </w:tc>
+        <w:tc>
+          <w:tcPr>
+            <w:tcW w:w="0" w:type="auto"/>
+            <w:hideMark/>
+          </w:tcPr>
+          <w:p>
+            <w:pPr>
+              <w:spacing w:after="160" w:line="360" w:lineRule="auto"/>
+              <w:rPr>
+                <w:rFonts w:cs="Times New Roman"/>
+                <w:szCs w:val="24"/>
+                <w:lang w:val="da-DK"/>
+              </w:rPr>
+            </w:pPr>
+            <w:proofErr w:type="spellStart"/>
+            <w:r>
+              <w:rPr>
+                <w:rFonts w:cs="Times New Roman"/>
+                <w:szCs w:val="24"/>
+                <w:lang w:val="da-DK"/>
+              </w:rPr>
+              <w:t>Authenticates</w:t>
+            </w:r>
+            <w:proofErr w:type="spellEnd"/>
+            <w:r>
+              <w:rPr>
+                <w:rFonts w:cs="Times New Roman"/>
+                <w:szCs w:val="24"/>
+                <w:lang w:val="da-DK"/>
+              </w:rPr>
+              <w:t xml:space="preserve"> a </w:t>
+            </w:r>
+            <w:proofErr w:type="spellStart"/>
+            <w:r>
+              <w:rPr>
+                <w:rFonts w:cs="Times New Roman"/>
+                <w:szCs w:val="24"/>
+                <w:lang w:val="da-DK"/>
+              </w:rPr>
+              <w:t>seeded</w:t>
+            </w:r>
+            <w:proofErr w:type="spellEnd"/>
+            <w:r>
+              <w:rPr>
+                <w:rFonts w:cs="Times New Roman"/>
+                <w:szCs w:val="24"/>
+                <w:lang w:val="da-DK"/>
+              </w:rPr>
+              <w:t xml:space="preserve"> user and </w:t>
+            </w:r>
+            <w:proofErr w:type="spellStart"/>
+            <w:r>
+              <w:rPr>
+                <w:rFonts w:cs="Times New Roman"/>
+                <w:szCs w:val="24"/>
+                <w:lang w:val="da-DK"/>
+              </w:rPr>
+              <w:t>establishes</w:t>
+            </w:r>
+            <w:proofErr w:type="spellEnd"/>
+            <w:r>
+              <w:rPr>
+                <w:rFonts w:cs="Times New Roman"/>
+                <w:szCs w:val="24"/>
+                <w:lang w:val="da-DK"/>
+              </w:rPr>
+              <w:t xml:space="preserve"> the </w:t>
+            </w:r>
+            <w:proofErr w:type="spellStart"/>
+            <w:proofErr w:type="gramStart"/>
+            <w:r>
+              <w:rPr>
+                <w:rFonts w:cs="Times New Roman"/>
+                <w:szCs w:val="24"/>
+                <w:lang w:val="da-DK"/>
+              </w:rPr>
+              <w:t>user's</w:t>
+            </w:r>
+            <w:proofErr w:type="spellEnd"/>
+            <w:proofErr w:type="gramEnd"/>
+            <w:r>
+              <w:rPr>
+                <w:rFonts w:cs="Times New Roman"/>
+                <w:szCs w:val="24"/>
+                <w:lang w:val="da-DK"/>
+              </w:rPr>
+              <w:t xml:space="preserve"> </w:t>
+            </w:r>
+            <w:proofErr w:type="spellStart"/>
+            <w:r>
+              <w:rPr>
+                <w:rFonts w:cs="Times New Roman"/>
+                <w:szCs w:val="24"/>
+                <w:lang w:val="da-DK"/>
+              </w:rPr>
+              <w:t>identity</w:t>
+            </w:r>
+            <w:proofErr w:type="spellEnd"/>
+            <w:r>
+              <w:rPr>
+                <w:rFonts w:cs="Times New Roman"/>
+                <w:szCs w:val="24"/>
+                <w:lang w:val="da-DK"/>
+              </w:rPr>
+              <w:t xml:space="preserve"> and </w:t>
+            </w:r>
+            <w:proofErr w:type="spellStart"/>
+            <w:r>
+              <w:rPr>
+                <w:rFonts w:cs="Times New Roman"/>
+                <w:szCs w:val="24"/>
+                <w:lang w:val="da-DK"/>
+              </w:rPr>
+              <w:t>role</w:t>
+            </w:r>
+            <w:proofErr w:type="spellEnd"/>
+            <w:r>
+              <w:rPr>
+                <w:rFonts w:cs="Times New Roman"/>
+                <w:szCs w:val="24"/>
+                <w:lang w:val="da-DK"/>
+              </w:rPr>
+              <w:t>.</w:t>
+            </w:r>
+          </w:p>
+        </w:tc>
+      </w:tr>
+      <w:tr>
+        <w:tc>
+          <w:tcPr>
+            <w:tcW w:w="0" w:type="auto"/>
+            <w:hideMark/>
+          </w:tcPr>
+          <w:p>
+            <w:pPr>
+              <w:spacing w:after="160" w:line="360" w:lineRule="auto"/>
+              <w:rPr>
+                <w:rFonts w:cs="Times New Roman"/>
+                <w:szCs w:val="24"/>
+                <w:lang w:val="da-DK"/>
+              </w:rPr>
+            </w:pPr>
+            <w:r>
+              <w:rPr>
+                <w:rFonts w:cs="Times New Roman"/>
+                <w:szCs w:val="24"/>
+                <w:lang w:val="da-DK"/>
+              </w:rPr>
+              <w:t>OP2</w:t>
+            </w:r>
+          </w:p>
+        </w:tc>
+        <w:tc>
+          <w:tcPr>
+            <w:tcW w:w="0" w:type="auto"/>
+            <w:hideMark/>
+          </w:tcPr>
+          <w:p>
+            <w:pPr>
+              <w:spacing w:after="160" w:line="360" w:lineRule="auto"/>
+              <w:rPr>
+                <w:rFonts w:cs="Times New Roman"/>
+                <w:szCs w:val="24"/>
+                <w:lang w:val="da-DK"/>
+              </w:rPr>
+            </w:pPr>
+            <w:r>
+              <w:rPr>
+                <w:rFonts w:cs="Times New Roman"/>
+                <w:szCs w:val="24"/>
+                <w:lang w:val="da-DK"/>
+              </w:rPr>
+              <w:t xml:space="preserve">View </w:t>
+            </w:r>
+            <w:proofErr w:type="spellStart"/>
+            <w:r>
+              <w:rPr>
+                <w:rFonts w:cs="Times New Roman"/>
+                <w:szCs w:val="24"/>
+                <w:lang w:val="da-DK"/>
+              </w:rPr>
+              <w:t>Own</w:t>
+            </w:r>
+            <w:proofErr w:type="spellEnd"/>
+            <w:r>
+              <w:rPr>
+                <w:rFonts w:cs="Times New Roman"/>
+                <w:szCs w:val="24"/>
+                <w:lang w:val="da-DK"/>
+              </w:rPr>
+              <w:t xml:space="preserve"> Bookings</w:t>
+            </w:r>
+          </w:p>
+        </w:tc>
+        <w:tc>
+          <w:tcPr>
+            <w:tcW w:w="0" w:type="auto"/>
+            <w:hideMark/>
+          </w:tcPr>
+          <w:p>
+            <w:pPr>
+              <w:spacing w:after="160" w:line="360" w:lineRule="auto"/>
+              <w:rPr>
+                <w:rFonts w:cs="Times New Roman"/>
+                <w:szCs w:val="24"/>
+                <w:lang w:val="da-DK"/>
+              </w:rPr>
+            </w:pPr>
+            <w:r>
+              <w:rPr>
+                <w:rFonts w:cs="Times New Roman"/>
+                <w:szCs w:val="24"/>
+                <w:lang w:val="da-DK"/>
+              </w:rPr>
+              <w:t xml:space="preserve">User / </w:t>
+            </w:r>
+            <w:proofErr w:type="spellStart"/>
+            <w:r>
+              <w:rPr>
+                <w:rFonts w:cs="Times New Roman"/>
+                <w:szCs w:val="24"/>
+                <w:lang w:val="da-DK"/>
+              </w:rPr>
+              <w:t>Admin</w:t>
+            </w:r>
+            <w:proofErr w:type="spellEnd"/>
+          </w:p>
+        </w:tc>
+        <w:tc>
+          <w:tcPr>
+            <w:tcW w:w="0" w:type="auto"/>
+            <w:hideMark/>
+          </w:tcPr>
+          <w:p>
+            <w:pPr>
+              <w:spacing w:after="160" w:line="360" w:lineRule="auto"/>
+              <w:rPr>
+                <w:rFonts w:cs="Times New Roman"/>
+                <w:szCs w:val="24"/>
+                <w:lang w:val="da-DK"/>
+              </w:rPr>
+            </w:pPr>
+            <w:r>
+              <w:rPr>
+                <w:rFonts w:cs="Times New Roman"/>
+                <w:szCs w:val="24"/>
+                <w:lang w:val="da-DK"/>
+              </w:rPr>
+              <w:t>API Service, Resource Service</w:t>
+            </w:r>
+          </w:p>
+        </w:tc>
+        <w:tc>
+          <w:tcPr>
+            <w:tcW w:w="0" w:type="auto"/>
+            <w:hideMark/>
+          </w:tcPr>
+          <w:p>
+            <w:pPr>
+              <w:spacing w:after="160" w:line="360" w:lineRule="auto"/>
+              <w:rPr>
+                <w:rFonts w:cs="Times New Roman"/>
+                <w:szCs w:val="24"/>
+                <w:lang w:val="da-DK"/>
+              </w:rPr>
+            </w:pPr>
+            <w:proofErr w:type="spellStart"/>
+            <w:r>
+              <w:rPr>
+                <w:rFonts w:cs="Times New Roman"/>
+                <w:szCs w:val="24"/>
+                <w:lang w:val="da-DK"/>
+              </w:rPr>
+              <w:t>Retrieves</w:t>
+            </w:r>
+            <w:proofErr w:type="spellEnd"/>
+            <w:r>
+              <w:rPr>
+                <w:rFonts w:cs="Times New Roman"/>
+                <w:szCs w:val="24"/>
+                <w:lang w:val="da-DK"/>
+              </w:rPr>
+              <w:t xml:space="preserve"> booking </w:t>
+            </w:r>
+            <w:proofErr w:type="spellStart"/>
+            <w:r>
+              <w:rPr>
+                <w:rFonts w:cs="Times New Roman"/>
+                <w:szCs w:val="24"/>
+                <w:lang w:val="da-DK"/>
+              </w:rPr>
+              <w:t>records</w:t>
+            </w:r>
+            <w:proofErr w:type="spellEnd"/>
+            <w:r>
+              <w:rPr>
+                <w:rFonts w:cs="Times New Roman"/>
+                <w:szCs w:val="24"/>
+                <w:lang w:val="da-DK"/>
+              </w:rPr>
+              <w:t xml:space="preserve"> </w:t>
+            </w:r>
+            <w:proofErr w:type="spellStart"/>
+            <w:r>
+              <w:rPr>
+                <w:rFonts w:cs="Times New Roman"/>
+                <w:szCs w:val="24"/>
+                <w:lang w:val="da-DK"/>
+              </w:rPr>
+              <w:t>that</w:t>
+            </w:r>
+            <w:proofErr w:type="spellEnd"/>
+            <w:r>
+              <w:rPr>
+                <w:rFonts w:cs="Times New Roman"/>
+                <w:szCs w:val="24"/>
+                <w:lang w:val="da-DK"/>
+              </w:rPr>
+              <w:t xml:space="preserve"> the </w:t>
+            </w:r>
+            <w:proofErr w:type="spellStart"/>
+            <w:r>
+              <w:rPr>
+                <w:rFonts w:cs="Times New Roman"/>
+                <w:szCs w:val="24"/>
+                <w:lang w:val="da-DK"/>
+              </w:rPr>
+              <w:t>authenticated</w:t>
+            </w:r>
+            <w:proofErr w:type="spellEnd"/>
+            <w:r>
+              <w:rPr>
+                <w:rFonts w:cs="Times New Roman"/>
+                <w:szCs w:val="24"/>
+                <w:lang w:val="da-DK"/>
+              </w:rPr>
+              <w:t xml:space="preserve"> user is </w:t>
+            </w:r>
+            <w:proofErr w:type="spellStart"/>
+            <w:r>
+              <w:rPr>
+                <w:rFonts w:cs="Times New Roman"/>
+                <w:szCs w:val="24"/>
+                <w:lang w:val="da-DK"/>
+              </w:rPr>
+              <w:t>authorized</w:t>
+            </w:r>
+            <w:proofErr w:type="spellEnd"/>
+            <w:r>
+              <w:rPr>
+                <w:rFonts w:cs="Times New Roman"/>
+                <w:szCs w:val="24"/>
+                <w:lang w:val="da-DK"/>
+              </w:rPr>
+              <w:t xml:space="preserve"> to </w:t>
+            </w:r>
+            <w:proofErr w:type="spellStart"/>
+            <w:r>
+              <w:rPr>
+                <w:rFonts w:cs="Times New Roman"/>
+                <w:szCs w:val="24"/>
+                <w:lang w:val="da-DK"/>
+              </w:rPr>
+              <w:t>access</w:t>
+            </w:r>
+            <w:proofErr w:type="spellEnd"/>
+            <w:r>
+              <w:rPr>
+                <w:rFonts w:cs="Times New Roman"/>
+                <w:szCs w:val="24"/>
+                <w:lang w:val="da-DK"/>
+              </w:rPr>
+              <w:t>.</w:t>
+            </w:r>
+          </w:p>
+        </w:tc>
+      </w:tr>
+      <w:tr>
+        <w:tc>
+          <w:tcPr>
+            <w:tcW w:w="0" w:type="auto"/>
+            <w:hideMark/>
+          </w:tcPr>
+          <w:p>
+            <w:pPr>
+              <w:spacing w:after="160" w:line="360" w:lineRule="auto"/>
+              <w:rPr>
+                <w:rFonts w:cs="Times New Roman"/>
+                <w:szCs w:val="24"/>
+                <w:lang w:val="da-DK"/>
+              </w:rPr>
+            </w:pPr>
+            <w:r>
+              <w:rPr>
+                <w:rFonts w:cs="Times New Roman"/>
+                <w:szCs w:val="24"/>
+                <w:lang w:val="da-DK"/>
+              </w:rPr>
+              <w:t>OP3</w:t>
+            </w:r>
+          </w:p>
+        </w:tc>
+        <w:tc>
+          <w:tcPr>
+            <w:tcW w:w="0" w:type="auto"/>
+            <w:hideMark/>
+          </w:tcPr>
+          <w:p>
+            <w:pPr>
+              <w:spacing w:after="160" w:line="360" w:lineRule="auto"/>
+              <w:rPr>
+                <w:rFonts w:cs="Times New Roman"/>
+                <w:szCs w:val="24"/>
+                <w:lang w:val="da-DK"/>
+              </w:rPr>
+            </w:pPr>
+            <w:r>
+              <w:rPr>
+                <w:rFonts w:cs="Times New Roman"/>
+                <w:szCs w:val="24"/>
+                <w:lang w:val="da-DK"/>
+              </w:rPr>
+              <w:t xml:space="preserve">View </w:t>
+            </w:r>
+            <w:proofErr w:type="spellStart"/>
+            <w:r>
+              <w:rPr>
+                <w:rFonts w:cs="Times New Roman"/>
+                <w:szCs w:val="24"/>
+                <w:lang w:val="da-DK"/>
+              </w:rPr>
+              <w:t>Specific</w:t>
+            </w:r>
+            <w:proofErr w:type="spellEnd"/>
+            <w:r>
+              <w:rPr>
+                <w:rFonts w:cs="Times New Roman"/>
+                <w:szCs w:val="24"/>
+                <w:lang w:val="da-DK"/>
+              </w:rPr>
+              <w:t xml:space="preserve"> Booking</w:t>
+            </w:r>
+          </w:p>
+        </w:tc>
+        <w:tc>
+          <w:tcPr>
+            <w:tcW w:w="0" w:type="auto"/>
+            <w:hideMark/>
+          </w:tcPr>
+          <w:p>
+            <w:pPr>
+              <w:spacing w:after="160" w:line="360" w:lineRule="auto"/>
+              <w:rPr>
+                <w:rFonts w:cs="Times New Roman"/>
+                <w:szCs w:val="24"/>
+                <w:lang w:val="da-DK"/>
+              </w:rPr>
+            </w:pPr>
+            <w:r>
+              <w:rPr>
+                <w:rFonts w:cs="Times New Roman"/>
+                <w:szCs w:val="24"/>
+                <w:lang w:val="da-DK"/>
+              </w:rPr>
+              <w:t xml:space="preserve">User / </w:t>
+            </w:r>
+            <w:proofErr w:type="spellStart"/>
+            <w:r>
+              <w:rPr>
+                <w:rFonts w:cs="Times New Roman"/>
+                <w:szCs w:val="24"/>
+                <w:lang w:val="da-DK"/>
+              </w:rPr>
+              <w:t>Admin</w:t>
+            </w:r>
+            <w:proofErr w:type="spellEnd"/>
+          </w:p>
+        </w:tc>
+        <w:tc>
+          <w:tcPr>
+            <w:tcW w:w="0" w:type="auto"/>
+            <w:hideMark/>
+          </w:tcPr>
+          <w:p>
+            <w:pPr>
+              <w:spacing w:after="160" w:line="360" w:lineRule="auto"/>
+              <w:rPr>
+                <w:rFonts w:cs="Times New Roman"/>
+                <w:szCs w:val="24"/>
+                <w:lang w:val="da-DK"/>
+              </w:rPr>
+            </w:pPr>
+            <w:r>
+              <w:rPr>
+                <w:rFonts w:cs="Times New Roman"/>
+                <w:szCs w:val="24"/>
+                <w:lang w:val="da-DK"/>
+              </w:rPr>
+              <w:t>API Service, Resource Service</w:t>
+            </w:r>
+          </w:p>
+        </w:tc>
+        <w:tc>
+          <w:tcPr>
+            <w:tcW w:w="0" w:type="auto"/>
+            <w:hideMark/>
+          </w:tcPr>
+          <w:p>
+            <w:pPr>
+              <w:spacing w:after="160" w:line="360" w:lineRule="auto"/>
+              <w:rPr>
+                <w:rFonts w:cs="Times New Roman"/>
+                <w:szCs w:val="24"/>
+                <w:lang w:val="da-DK"/>
+              </w:rPr>
+            </w:pPr>
+            <w:proofErr w:type="spellStart"/>
+            <w:r>
+              <w:rPr>
+                <w:rFonts w:cs="Times New Roman"/>
+                <w:szCs w:val="24"/>
+                <w:lang w:val="da-DK"/>
+              </w:rPr>
+              <w:t>Retrieves</w:t>
+            </w:r>
+            <w:proofErr w:type="spellEnd"/>
+            <w:r>
+              <w:rPr>
+                <w:rFonts w:cs="Times New Roman"/>
+                <w:szCs w:val="24"/>
+                <w:lang w:val="da-DK"/>
+              </w:rPr>
+              <w:t xml:space="preserve"> a </w:t>
+            </w:r>
+            <w:proofErr w:type="spellStart"/>
+            <w:r>
+              <w:rPr>
+                <w:rFonts w:cs="Times New Roman"/>
+                <w:szCs w:val="24"/>
+                <w:lang w:val="da-DK"/>
+              </w:rPr>
+              <w:t>specific</w:t>
+            </w:r>
+            <w:proofErr w:type="spellEnd"/>
+            <w:r>
+              <w:rPr>
+                <w:rFonts w:cs="Times New Roman"/>
+                <w:szCs w:val="24"/>
+                <w:lang w:val="da-DK"/>
+              </w:rPr>
+              <w:t xml:space="preserve"> booking </w:t>
+            </w:r>
+            <w:proofErr w:type="spellStart"/>
+            <w:r>
+              <w:rPr>
+                <w:rFonts w:cs="Times New Roman"/>
+                <w:szCs w:val="24"/>
+                <w:lang w:val="da-DK"/>
+              </w:rPr>
+              <w:t>after</w:t>
+            </w:r>
+            <w:proofErr w:type="spellEnd"/>
+            <w:r>
+              <w:rPr>
+                <w:rFonts w:cs="Times New Roman"/>
+                <w:szCs w:val="24"/>
+                <w:lang w:val="da-DK"/>
+              </w:rPr>
+              <w:t xml:space="preserve"> </w:t>
+            </w:r>
+            <w:proofErr w:type="spellStart"/>
+            <w:r>
+              <w:rPr>
+                <w:rFonts w:cs="Times New Roman"/>
+                <w:szCs w:val="24"/>
+                <w:lang w:val="da-DK"/>
+              </w:rPr>
+              <w:t>verifying</w:t>
+            </w:r>
+            <w:proofErr w:type="spellEnd"/>
+            <w:r>
+              <w:rPr>
+                <w:rFonts w:cs="Times New Roman"/>
+                <w:szCs w:val="24"/>
+                <w:lang w:val="da-DK"/>
+              </w:rPr>
+              <w:t xml:space="preserve"> </w:t>
+            </w:r>
+            <w:proofErr w:type="spellStart"/>
+            <w:r>
+              <w:rPr>
+                <w:rFonts w:cs="Times New Roman"/>
+                <w:szCs w:val="24"/>
+                <w:lang w:val="da-DK"/>
+              </w:rPr>
+              <w:t>that</w:t>
+            </w:r>
+            <w:proofErr w:type="spellEnd"/>
+            <w:r>
+              <w:rPr>
+                <w:rFonts w:cs="Times New Roman"/>
+                <w:szCs w:val="24"/>
+                <w:lang w:val="da-DK"/>
+              </w:rPr>
+              <w:t xml:space="preserve"> the </w:t>
+            </w:r>
+            <w:proofErr w:type="spellStart"/>
+            <w:r>
+              <w:rPr>
+                <w:rFonts w:cs="Times New Roman"/>
+                <w:szCs w:val="24"/>
+                <w:lang w:val="da-DK"/>
+              </w:rPr>
+              <w:t>requester</w:t>
+            </w:r>
+            <w:proofErr w:type="spellEnd"/>
+            <w:r>
+              <w:rPr>
+                <w:rFonts w:cs="Times New Roman"/>
+                <w:szCs w:val="24"/>
+                <w:lang w:val="da-DK"/>
+              </w:rPr>
+              <w:t xml:space="preserve"> is </w:t>
+            </w:r>
+            <w:proofErr w:type="spellStart"/>
+            <w:r>
+              <w:rPr>
+                <w:rFonts w:cs="Times New Roman"/>
+                <w:szCs w:val="24"/>
+                <w:lang w:val="da-DK"/>
+              </w:rPr>
+              <w:t>authorized</w:t>
+            </w:r>
+            <w:proofErr w:type="spellEnd"/>
+            <w:r>
+              <w:rPr>
+                <w:rFonts w:cs="Times New Roman"/>
+                <w:szCs w:val="24"/>
+                <w:lang w:val="da-DK"/>
+              </w:rPr>
+              <w:t xml:space="preserve"> to </w:t>
+            </w:r>
+            <w:proofErr w:type="spellStart"/>
+            <w:r>
+              <w:rPr>
+                <w:rFonts w:cs="Times New Roman"/>
+                <w:szCs w:val="24"/>
+                <w:lang w:val="da-DK"/>
+              </w:rPr>
+              <w:t>access</w:t>
+            </w:r>
+            <w:proofErr w:type="spellEnd"/>
+            <w:r>
+              <w:rPr>
+                <w:rFonts w:cs="Times New Roman"/>
+                <w:szCs w:val="24"/>
+                <w:lang w:val="da-DK"/>
+              </w:rPr>
+              <w:t xml:space="preserve"> it.</w:t>
+            </w:r>
+          </w:p>
+        </w:tc>
+      </w:tr>
+      <w:tr>
+        <w:tc>
+          <w:tcPr>
+            <w:tcW w:w="0" w:type="auto"/>
+            <w:hideMark/>
+          </w:tcPr>
+          <w:p>
+            <w:pPr>
+              <w:spacing w:after="160" w:line="360" w:lineRule="auto"/>
+              <w:rPr>
+                <w:rFonts w:cs="Times New Roman"/>
+                <w:szCs w:val="24"/>
+                <w:lang w:val="da-DK"/>
+              </w:rPr>
+            </w:pPr>
+            <w:r>
+              <w:rPr>
+                <w:rFonts w:cs="Times New Roman"/>
+                <w:szCs w:val="24"/>
+                <w:lang w:val="da-DK"/>
+              </w:rPr>
+              <w:t>OP4</w:t>
+            </w:r>
+          </w:p>
+        </w:tc>
+        <w:tc>
+          <w:tcPr>
+            <w:tcW w:w="0" w:type="auto"/>
+            <w:hideMark/>
+          </w:tcPr>
+          <w:p>
+            <w:pPr>
+              <w:spacing w:after="160" w:line="360" w:lineRule="auto"/>
+              <w:rPr>
+                <w:rFonts w:cs="Times New Roman"/>
+                <w:szCs w:val="24"/>
+                <w:lang w:val="da-DK"/>
+              </w:rPr>
+            </w:pPr>
+            <w:proofErr w:type="spellStart"/>
+            <w:r>
+              <w:rPr>
+                <w:rFonts w:cs="Times New Roman"/>
+                <w:szCs w:val="24"/>
+                <w:lang w:val="da-DK"/>
+              </w:rPr>
+              <w:t>Manage</w:t>
+            </w:r>
+            <w:proofErr w:type="spellEnd"/>
+            <w:r>
+              <w:rPr>
+                <w:rFonts w:cs="Times New Roman"/>
+                <w:szCs w:val="24"/>
+                <w:lang w:val="da-DK"/>
+              </w:rPr>
+              <w:t xml:space="preserve"> Booking</w:t>
+            </w:r>
+          </w:p>
+        </w:tc>
+        <w:tc>
+          <w:tcPr>
+            <w:tcW w:w="0" w:type="auto"/>
+            <w:hideMark/>
+          </w:tcPr>
+          <w:p>
+            <w:pPr>
+              <w:spacing w:after="160" w:line="360" w:lineRule="auto"/>
+              <w:rPr>
+                <w:rFonts w:cs="Times New Roman"/>
+                <w:szCs w:val="24"/>
+                <w:lang w:val="da-DK"/>
+              </w:rPr>
+            </w:pPr>
+            <w:proofErr w:type="spellStart"/>
+            <w:r>
+              <w:rPr>
+                <w:rFonts w:cs="Times New Roman"/>
+                <w:szCs w:val="24"/>
+                <w:lang w:val="da-DK"/>
+              </w:rPr>
+              <w:t>Admin</w:t>
+            </w:r>
+            <w:proofErr w:type="spellEnd"/>
+          </w:p>
+        </w:tc>
+        <w:tc>
+          <w:tcPr>
+            <w:tcW w:w="0" w:type="auto"/>
+            <w:hideMark/>
+          </w:tcPr>
+          <w:p>
+            <w:pPr>
+              <w:spacing w:after="160" w:line="360" w:lineRule="auto"/>
+              <w:rPr>
+                <w:rFonts w:cs="Times New Roman"/>
+                <w:szCs w:val="24"/>
+                <w:lang w:val="da-DK"/>
+              </w:rPr>
+            </w:pPr>
+            <w:r>
+              <w:rPr>
+                <w:rFonts w:cs="Times New Roman"/>
+                <w:szCs w:val="24"/>
+                <w:lang w:val="da-DK"/>
+              </w:rPr>
+              <w:t>API Service, Resource Service</w:t>
+            </w:r>
+          </w:p>
+        </w:tc>
+        <w:tc>
+          <w:tcPr>
+            <w:tcW w:w="0" w:type="auto"/>
+            <w:hideMark/>
+          </w:tcPr>
+          <w:p>
+            <w:pPr>
+              <w:spacing w:after="160" w:line="360" w:lineRule="auto"/>
+              <w:rPr>
+                <w:rFonts w:cs="Times New Roman"/>
+                <w:szCs w:val="24"/>
+                <w:lang w:val="da-DK"/>
+              </w:rPr>
+            </w:pPr>
+            <w:proofErr w:type="spellStart"/>
+            <w:r>
+              <w:rPr>
+                <w:rFonts w:cs="Times New Roman"/>
+                <w:szCs w:val="24"/>
+                <w:lang w:val="da-DK"/>
+              </w:rPr>
+              <w:t>Allows</w:t>
+            </w:r>
+            <w:proofErr w:type="spellEnd"/>
+            <w:r>
+              <w:rPr>
+                <w:rFonts w:cs="Times New Roman"/>
+                <w:szCs w:val="24"/>
+                <w:lang w:val="da-DK"/>
+              </w:rPr>
+              <w:t xml:space="preserve"> an administrator to perform a </w:t>
+            </w:r>
+            <w:proofErr w:type="spellStart"/>
+            <w:r>
+              <w:rPr>
+                <w:rFonts w:cs="Times New Roman"/>
+                <w:szCs w:val="24"/>
+                <w:lang w:val="da-DK"/>
+              </w:rPr>
+              <w:t>restricted</w:t>
+            </w:r>
+            <w:proofErr w:type="spellEnd"/>
+            <w:r>
+              <w:rPr>
+                <w:rFonts w:cs="Times New Roman"/>
+                <w:szCs w:val="24"/>
+                <w:lang w:val="da-DK"/>
+              </w:rPr>
+              <w:t xml:space="preserve"> management operation on a booking.</w:t>
+            </w:r>
+          </w:p>
+        </w:tc>
+      </w:tr>
+      <w:tr>
+        <w:tc>
+          <w:tcPr>
+            <w:tcW w:w="0" w:type="auto"/>
+            <w:hideMark/>
+          </w:tcPr>
+          <w:p>
+            <w:pPr>
+              <w:spacing w:after="160" w:line="360" w:lineRule="auto"/>
+              <w:rPr>
+                <w:rFonts w:cs="Times New Roman"/>
+                <w:szCs w:val="24"/>
+                <w:lang w:val="da-DK"/>
+              </w:rPr>
+            </w:pPr>
+            <w:r>
+              <w:rPr>
+                <w:rFonts w:cs="Times New Roman"/>
+                <w:szCs w:val="24"/>
+                <w:lang w:val="da-DK"/>
+              </w:rPr>
+              <w:t>OP5</w:t>
+            </w:r>
+          </w:p>
+        </w:tc>
+        <w:tc>
+          <w:tcPr>
+            <w:tcW w:w="0" w:type="auto"/>
+            <w:hideMark/>
+          </w:tcPr>
+          <w:p>
+            <w:pPr>
+              <w:spacing w:after="160" w:line="360" w:lineRule="auto"/>
+              <w:rPr>
+                <w:rFonts w:cs="Times New Roman"/>
+                <w:szCs w:val="24"/>
+                <w:lang w:val="da-DK"/>
+              </w:rPr>
+            </w:pPr>
+            <w:proofErr w:type="spellStart"/>
+            <w:r>
+              <w:rPr>
+                <w:rFonts w:cs="Times New Roman"/>
+                <w:szCs w:val="24"/>
+                <w:lang w:val="da-DK"/>
+              </w:rPr>
+              <w:t>Generate</w:t>
+            </w:r>
+            <w:proofErr w:type="spellEnd"/>
+            <w:r>
+              <w:rPr>
+                <w:rFonts w:cs="Times New Roman"/>
+                <w:szCs w:val="24"/>
+                <w:lang w:val="da-DK"/>
+              </w:rPr>
+              <w:t xml:space="preserve"> Booking Summary</w:t>
+            </w:r>
+          </w:p>
+        </w:tc>
+        <w:tc>
+          <w:tcPr>
+            <w:tcW w:w="0" w:type="auto"/>
+            <w:hideMark/>
+          </w:tcPr>
+          <w:p>
+            <w:pPr>
+              <w:spacing w:after="160" w:line="360" w:lineRule="auto"/>
+              <w:rPr>
+                <w:rFonts w:cs="Times New Roman"/>
+                <w:szCs w:val="24"/>
+                <w:lang w:val="da-DK"/>
+              </w:rPr>
+            </w:pPr>
+            <w:r>
+              <w:rPr>
+                <w:rFonts w:cs="Times New Roman"/>
+                <w:szCs w:val="24"/>
+                <w:lang w:val="da-DK"/>
+              </w:rPr>
+              <w:t xml:space="preserve">User / </w:t>
+            </w:r>
+            <w:proofErr w:type="spellStart"/>
+            <w:r>
+              <w:rPr>
+                <w:rFonts w:cs="Times New Roman"/>
+                <w:szCs w:val="24"/>
+                <w:lang w:val="da-DK"/>
+              </w:rPr>
+              <w:t>Admin</w:t>
+            </w:r>
+            <w:proofErr w:type="spellEnd"/>
+          </w:p>
+        </w:tc>
+        <w:tc>
+          <w:tcPr>
+            <w:tcW w:w="0" w:type="auto"/>
+            <w:hideMark/>
+          </w:tcPr>
+          <w:p>
+            <w:pPr>
+              <w:spacing w:after="160" w:line="360" w:lineRule="auto"/>
+              <w:rPr>
+                <w:rFonts w:cs="Times New Roman"/>
+                <w:szCs w:val="24"/>
+                <w:lang w:val="da-DK"/>
+              </w:rPr>
+            </w:pPr>
+            <w:r>
+              <w:rPr>
+                <w:rFonts w:cs="Times New Roman"/>
+                <w:szCs w:val="24"/>
+                <w:lang w:val="da-DK"/>
+              </w:rPr>
+              <w:t>API Service, Processing Service, Resource Service</w:t>
+            </w:r>
+          </w:p>
+        </w:tc>
+        <w:tc>
+          <w:tcPr>
+            <w:tcW w:w="0" w:type="auto"/>
+            <w:hideMark/>
+          </w:tcPr>
+          <w:p>
+            <w:pPr>
+              <w:spacing w:after="160" w:line="360" w:lineRule="auto"/>
+              <w:rPr>
+                <w:rFonts w:cs="Times New Roman"/>
+                <w:szCs w:val="24"/>
+                <w:lang w:val="da-DK"/>
+              </w:rPr>
+            </w:pPr>
+            <w:proofErr w:type="spellStart"/>
+            <w:r>
+              <w:rPr>
+                <w:rFonts w:cs="Times New Roman"/>
+                <w:szCs w:val="24"/>
+                <w:lang w:val="da-DK"/>
+              </w:rPr>
+              <w:t>Requests</w:t>
+            </w:r>
+            <w:proofErr w:type="spellEnd"/>
+            <w:r>
+              <w:rPr>
+                <w:rFonts w:cs="Times New Roman"/>
+                <w:szCs w:val="24"/>
+                <w:lang w:val="da-DK"/>
+              </w:rPr>
+              <w:t xml:space="preserve"> </w:t>
+            </w:r>
+            <w:proofErr w:type="spellStart"/>
+            <w:r>
+              <w:rPr>
+                <w:rFonts w:cs="Times New Roman"/>
+                <w:szCs w:val="24"/>
+                <w:lang w:val="da-DK"/>
+              </w:rPr>
+              <w:t>processing</w:t>
+            </w:r>
+            <w:proofErr w:type="spellEnd"/>
+            <w:r>
+              <w:rPr>
+                <w:rFonts w:cs="Times New Roman"/>
+                <w:szCs w:val="24"/>
+                <w:lang w:val="da-DK"/>
+              </w:rPr>
+              <w:t xml:space="preserve"> of </w:t>
+            </w:r>
+            <w:proofErr w:type="spellStart"/>
+            <w:r>
+              <w:rPr>
+                <w:rFonts w:cs="Times New Roman"/>
+                <w:szCs w:val="24"/>
+                <w:lang w:val="da-DK"/>
+              </w:rPr>
+              <w:t>authorized</w:t>
+            </w:r>
+            <w:proofErr w:type="spellEnd"/>
+            <w:r>
+              <w:rPr>
+                <w:rFonts w:cs="Times New Roman"/>
+                <w:szCs w:val="24"/>
+                <w:lang w:val="da-DK"/>
+              </w:rPr>
+              <w:t xml:space="preserve"> booking data. The API Service </w:t>
+            </w:r>
+            <w:proofErr w:type="spellStart"/>
+            <w:r>
+              <w:rPr>
+                <w:rFonts w:cs="Times New Roman"/>
+                <w:szCs w:val="24"/>
+                <w:lang w:val="da-DK"/>
+              </w:rPr>
+              <w:t>coordinates</w:t>
+            </w:r>
+            <w:proofErr w:type="spellEnd"/>
+            <w:r>
+              <w:rPr>
+                <w:rFonts w:cs="Times New Roman"/>
+                <w:szCs w:val="24"/>
+                <w:lang w:val="da-DK"/>
+              </w:rPr>
+              <w:t xml:space="preserve"> the </w:t>
+            </w:r>
+            <w:proofErr w:type="spellStart"/>
+            <w:r>
+              <w:rPr>
+                <w:rFonts w:cs="Times New Roman"/>
+                <w:szCs w:val="24"/>
+                <w:lang w:val="da-DK"/>
+              </w:rPr>
+              <w:t>request</w:t>
+            </w:r>
+            <w:proofErr w:type="spellEnd"/>
+            <w:r>
+              <w:rPr>
+                <w:rFonts w:cs="Times New Roman"/>
+                <w:szCs w:val="24"/>
+                <w:lang w:val="da-DK"/>
+              </w:rPr>
+              <w:t xml:space="preserve">, the Processing Service performs the summary operation </w:t>
+            </w:r>
+            <w:proofErr w:type="spellStart"/>
+            <w:r>
+              <w:rPr>
+                <w:rFonts w:cs="Times New Roman"/>
+                <w:szCs w:val="24"/>
+                <w:lang w:val="da-DK"/>
+              </w:rPr>
+              <w:t>using</w:t>
+            </w:r>
+            <w:proofErr w:type="spellEnd"/>
+            <w:r>
+              <w:rPr>
+                <w:rFonts w:cs="Times New Roman"/>
+                <w:szCs w:val="24"/>
+                <w:lang w:val="da-DK"/>
+              </w:rPr>
+              <w:t xml:space="preserve"> the </w:t>
+            </w:r>
+            <w:proofErr w:type="spellStart"/>
+            <w:r>
+              <w:rPr>
+                <w:rFonts w:cs="Times New Roman"/>
+                <w:szCs w:val="24"/>
+                <w:lang w:val="da-DK"/>
+              </w:rPr>
+              <w:t>helper</w:t>
+            </w:r>
+            <w:proofErr w:type="spellEnd"/>
+            <w:r>
+              <w:rPr>
+                <w:rFonts w:cs="Times New Roman"/>
+                <w:szCs w:val="24"/>
+                <w:lang w:val="da-DK"/>
+              </w:rPr>
+              <w:t xml:space="preserve"> </w:t>
+            </w:r>
+            <w:proofErr w:type="spellStart"/>
+            <w:r>
+              <w:rPr>
+                <w:rFonts w:cs="Times New Roman"/>
+                <w:szCs w:val="24"/>
+                <w:lang w:val="da-DK"/>
+              </w:rPr>
+              <w:t>package</w:t>
+            </w:r>
+            <w:proofErr w:type="spellEnd"/>
+            <w:r>
+              <w:rPr>
+                <w:rFonts w:cs="Times New Roman"/>
+                <w:szCs w:val="24"/>
+                <w:lang w:val="da-DK"/>
+              </w:rPr>
+              <w:t xml:space="preserve">, and the Resource Service provides the </w:t>
+            </w:r>
+            <w:proofErr w:type="spellStart"/>
+            <w:r>
+              <w:rPr>
+                <w:rFonts w:cs="Times New Roman"/>
+                <w:szCs w:val="24"/>
+                <w:lang w:val="da-DK"/>
+              </w:rPr>
+              <w:t>protected</w:t>
+            </w:r>
+            <w:proofErr w:type="spellEnd"/>
+            <w:r>
+              <w:rPr>
+                <w:rFonts w:cs="Times New Roman"/>
+                <w:szCs w:val="24"/>
+                <w:lang w:val="da-DK"/>
+              </w:rPr>
+              <w:t xml:space="preserve"> booking data.</w:t>
+            </w:r>
+          </w:p>
+        </w:tc>
+      </w:tr>
+      <w:tr>
+        <w:tc>
+          <w:tcPr>
+            <w:tcW w:w="0" w:type="auto"/>
+            <w:hideMark/>
+          </w:tcPr>
+          <w:p>
+            <w:pPr>
+              <w:spacing w:after="160" w:line="360" w:lineRule="auto"/>
+              <w:rPr>
+                <w:rFonts w:cs="Times New Roman"/>
+                <w:szCs w:val="24"/>
+                <w:lang w:val="da-DK"/>
+              </w:rPr>
+            </w:pPr>
+            <w:r>
+              <w:rPr>
+                <w:rFonts w:cs="Times New Roman"/>
+                <w:szCs w:val="24"/>
+                <w:lang w:val="da-DK"/>
+              </w:rPr>
+              <w:t>OP6</w:t>
+            </w:r>
+          </w:p>
+        </w:tc>
+        <w:tc>
+          <w:tcPr>
+            <w:tcW w:w="0" w:type="auto"/>
+            <w:hideMark/>
+          </w:tcPr>
+          <w:p>
+            <w:pPr>
+              <w:spacing w:after="160" w:line="360" w:lineRule="auto"/>
+              <w:rPr>
+                <w:rFonts w:cs="Times New Roman"/>
+                <w:szCs w:val="24"/>
+                <w:lang w:val="da-DK"/>
+              </w:rPr>
+            </w:pPr>
+            <w:proofErr w:type="spellStart"/>
+            <w:r>
+              <w:rPr>
+                <w:rFonts w:cs="Times New Roman"/>
+                <w:szCs w:val="24"/>
+                <w:lang w:val="da-DK"/>
+              </w:rPr>
+              <w:t>Retrieve</w:t>
+            </w:r>
+            <w:proofErr w:type="spellEnd"/>
+            <w:r>
+              <w:rPr>
+                <w:rFonts w:cs="Times New Roman"/>
+                <w:szCs w:val="24"/>
+                <w:lang w:val="da-DK"/>
+              </w:rPr>
+              <w:t xml:space="preserve"> Booking Summary</w:t>
+            </w:r>
+          </w:p>
+        </w:tc>
+        <w:tc>
+          <w:tcPr>
+            <w:tcW w:w="0" w:type="auto"/>
+            <w:hideMark/>
+          </w:tcPr>
+          <w:p>
+            <w:pPr>
+              <w:spacing w:after="160" w:line="360" w:lineRule="auto"/>
+              <w:rPr>
+                <w:rFonts w:cs="Times New Roman"/>
+                <w:szCs w:val="24"/>
+                <w:lang w:val="da-DK"/>
+              </w:rPr>
+            </w:pPr>
+            <w:r>
+              <w:rPr>
+                <w:rFonts w:cs="Times New Roman"/>
+                <w:szCs w:val="24"/>
+                <w:lang w:val="da-DK"/>
+              </w:rPr>
+              <w:t xml:space="preserve">User / </w:t>
+            </w:r>
+            <w:proofErr w:type="spellStart"/>
+            <w:r>
+              <w:rPr>
+                <w:rFonts w:cs="Times New Roman"/>
+                <w:szCs w:val="24"/>
+                <w:lang w:val="da-DK"/>
+              </w:rPr>
+              <w:t>Admin</w:t>
+            </w:r>
+            <w:proofErr w:type="spellEnd"/>
+          </w:p>
+        </w:tc>
+        <w:tc>
+          <w:tcPr>
+            <w:tcW w:w="0" w:type="auto"/>
+            <w:hideMark/>
+          </w:tcPr>
+          <w:p>
+            <w:pPr>
+              <w:spacing w:after="160" w:line="360" w:lineRule="auto"/>
+              <w:rPr>
+                <w:rFonts w:cs="Times New Roman"/>
+                <w:szCs w:val="24"/>
+                <w:lang w:val="da-DK"/>
+              </w:rPr>
+            </w:pPr>
+            <w:r>
+              <w:rPr>
+                <w:rFonts w:cs="Times New Roman"/>
+                <w:szCs w:val="24"/>
+                <w:lang w:val="da-DK"/>
+              </w:rPr>
+              <w:t>API Service, Resource Service</w:t>
+            </w:r>
+          </w:p>
+        </w:tc>
+        <w:tc>
+          <w:tcPr>
+            <w:tcW w:w="0" w:type="auto"/>
+            <w:hideMark/>
+          </w:tcPr>
+          <w:p>
+            <w:pPr>
+              <w:spacing w:after="160" w:line="360" w:lineRule="auto"/>
+              <w:rPr>
+                <w:rFonts w:cs="Times New Roman"/>
+                <w:szCs w:val="24"/>
+                <w:lang w:val="da-DK"/>
+              </w:rPr>
+            </w:pPr>
+            <w:proofErr w:type="spellStart"/>
+            <w:r>
+              <w:rPr>
+                <w:rFonts w:cs="Times New Roman"/>
+                <w:szCs w:val="24"/>
+                <w:lang w:val="da-DK"/>
+              </w:rPr>
+              <w:t>Retrieves</w:t>
+            </w:r>
+            <w:proofErr w:type="spellEnd"/>
+            <w:r>
+              <w:rPr>
+                <w:rFonts w:cs="Times New Roman"/>
+                <w:szCs w:val="24"/>
+                <w:lang w:val="da-DK"/>
+              </w:rPr>
+              <w:t xml:space="preserve"> a </w:t>
+            </w:r>
+            <w:proofErr w:type="spellStart"/>
+            <w:r>
+              <w:rPr>
+                <w:rFonts w:cs="Times New Roman"/>
+                <w:szCs w:val="24"/>
+                <w:lang w:val="da-DK"/>
+              </w:rPr>
+              <w:t>previously</w:t>
+            </w:r>
+            <w:proofErr w:type="spellEnd"/>
+            <w:r>
+              <w:rPr>
+                <w:rFonts w:cs="Times New Roman"/>
+                <w:szCs w:val="24"/>
+                <w:lang w:val="da-DK"/>
+              </w:rPr>
+              <w:t xml:space="preserve"> </w:t>
+            </w:r>
+            <w:proofErr w:type="spellStart"/>
+            <w:r>
+              <w:rPr>
+                <w:rFonts w:cs="Times New Roman"/>
+                <w:szCs w:val="24"/>
+                <w:lang w:val="da-DK"/>
+              </w:rPr>
+              <w:t>generated</w:t>
+            </w:r>
+            <w:proofErr w:type="spellEnd"/>
+            <w:r>
+              <w:rPr>
+                <w:rFonts w:cs="Times New Roman"/>
+                <w:szCs w:val="24"/>
+                <w:lang w:val="da-DK"/>
+              </w:rPr>
+              <w:t xml:space="preserve"> booking summary </w:t>
+            </w:r>
+            <w:proofErr w:type="spellStart"/>
+            <w:r>
+              <w:rPr>
+                <w:rFonts w:cs="Times New Roman"/>
+                <w:szCs w:val="24"/>
+                <w:lang w:val="da-DK"/>
+              </w:rPr>
+              <w:t>if</w:t>
+            </w:r>
+            <w:proofErr w:type="spellEnd"/>
+            <w:r>
+              <w:rPr>
+                <w:rFonts w:cs="Times New Roman"/>
+                <w:szCs w:val="24"/>
+                <w:lang w:val="da-DK"/>
+              </w:rPr>
+              <w:t xml:space="preserve"> the </w:t>
+            </w:r>
+            <w:proofErr w:type="spellStart"/>
+            <w:r>
+              <w:rPr>
+                <w:rFonts w:cs="Times New Roman"/>
+                <w:szCs w:val="24"/>
+                <w:lang w:val="da-DK"/>
+              </w:rPr>
+              <w:t>requester</w:t>
+            </w:r>
+            <w:proofErr w:type="spellEnd"/>
+            <w:r>
+              <w:rPr>
+                <w:rFonts w:cs="Times New Roman"/>
+                <w:szCs w:val="24"/>
+                <w:lang w:val="da-DK"/>
+              </w:rPr>
+              <w:t xml:space="preserve"> is </w:t>
+            </w:r>
+            <w:proofErr w:type="spellStart"/>
+            <w:r>
+              <w:rPr>
+                <w:rFonts w:cs="Times New Roman"/>
+                <w:szCs w:val="24"/>
+                <w:lang w:val="da-DK"/>
+              </w:rPr>
+              <w:t>authorized</w:t>
+            </w:r>
+            <w:proofErr w:type="spellEnd"/>
+            <w:r>
+              <w:rPr>
+                <w:rFonts w:cs="Times New Roman"/>
+                <w:szCs w:val="24"/>
+                <w:lang w:val="da-DK"/>
+              </w:rPr>
+              <w:t xml:space="preserve"> to </w:t>
+            </w:r>
+            <w:proofErr w:type="spellStart"/>
+            <w:r>
+              <w:rPr>
+                <w:rFonts w:cs="Times New Roman"/>
+                <w:szCs w:val="24"/>
+                <w:lang w:val="da-DK"/>
+              </w:rPr>
+              <w:t>access</w:t>
+            </w:r>
+            <w:proofErr w:type="spellEnd"/>
+            <w:r>
+              <w:rPr>
+                <w:rFonts w:cs="Times New Roman"/>
+                <w:szCs w:val="24"/>
+                <w:lang w:val="da-DK"/>
+              </w:rPr>
+              <w:t xml:space="preserve"> it.</w:t>
+            </w:r>
+          </w:p>
+        </w:tc>
+      </w:tr>
+    </w:tbl>
+    <w:p>
+      <w:pPr>
+        <w:spacing w:line="360" w:lineRule="auto"/>
+        <w:rPr>
+          <w:rFonts w:cs="Times New Roman"/>
+          <w:b/>
+          <w:bCs/>
+          <w:szCs w:val="24"/>
+          <w:lang w:val="da-DK"/>
+        </w:rPr>
+      </w:pPr>
+    </w:p>
+    <w:p>
+      <w:pPr>
+        <w:spacing w:line="360" w:lineRule="auto"/>
+        <w:rPr>
+          <w:rFonts w:cs="Times New Roman"/>
+          <w:b/>
+          <w:bCs/>
+          <w:szCs w:val="24"/>
+          <w:lang w:val="da-DK"/>
+        </w:rPr>
+      </w:pPr>
+    </w:p>
+    <w:p>
+      <w:pPr>
+        <w:spacing w:line="360" w:lineRule="auto"/>
+        <w:rPr>
+          <w:rFonts w:cs="Times New Roman"/>
+          <w:b/>
+          <w:bCs/>
+          <w:szCs w:val="24"/>
+          <w:lang w:val="da-DK"/>
+        </w:rPr>
+      </w:pPr>
+    </w:p>
+    <w:p>
+      <w:pPr>
+        <w:spacing w:line="360" w:lineRule="auto"/>
+        <w:rPr>
+          <w:rFonts w:cs="Times New Roman"/>
+          <w:b/>
+          <w:bCs/>
+          <w:szCs w:val="24"/>
+          <w:lang w:val="da-DK"/>
+        </w:rPr>
+      </w:pPr>
+      <w:r>
+        <w:rPr>
+          <w:rFonts w:cs="Times New Roman"/>
+          <w:b/>
+          <w:bCs/>
+          <w:szCs w:val="24"/>
+          <w:lang w:val="da-DK"/>
+        </w:rPr>
+        <w:lastRenderedPageBreak/>
+        <w:t>2.1 Three-Component Workflow</w:t>
+      </w:r>
+    </w:p>
+    <w:p>
+      <w:pPr>
+        <w:spacing w:line="360" w:lineRule="auto"/>
+        <w:rPr>
+          <w:rFonts w:cs="Times New Roman"/>
+          <w:szCs w:val="24"/>
+          <w:lang w:val="da-DK"/>
+        </w:rPr>
+      </w:pPr>
+      <w:r>
+        <w:rPr>
+          <w:rFonts w:cs="Times New Roman"/>
+          <w:szCs w:val="24"/>
+          <w:lang w:val="da-DK"/>
+        </w:rPr>
+        <w:t xml:space="preserve">OP5 is the </w:t>
+      </w:r>
+      <w:proofErr w:type="spellStart"/>
+      <w:proofErr w:type="gramStart"/>
+      <w:r>
+        <w:rPr>
+          <w:rFonts w:cs="Times New Roman"/>
+          <w:szCs w:val="24"/>
+          <w:lang w:val="da-DK"/>
+        </w:rPr>
+        <w:t>application's</w:t>
+      </w:r>
+      <w:proofErr w:type="spellEnd"/>
+      <w:proofErr w:type="gramEnd"/>
+      <w:r>
+        <w:rPr>
+          <w:rFonts w:cs="Times New Roman"/>
+          <w:szCs w:val="24"/>
+          <w:lang w:val="da-DK"/>
+        </w:rPr>
+        <w:t xml:space="preserve"> </w:t>
+      </w:r>
+      <w:proofErr w:type="spellStart"/>
+      <w:r>
+        <w:rPr>
+          <w:rFonts w:cs="Times New Roman"/>
+          <w:szCs w:val="24"/>
+          <w:lang w:val="da-DK"/>
+        </w:rPr>
+        <w:t>primary</w:t>
+      </w:r>
+      <w:proofErr w:type="spellEnd"/>
+      <w:r>
+        <w:rPr>
+          <w:rFonts w:cs="Times New Roman"/>
+          <w:szCs w:val="24"/>
+          <w:lang w:val="da-DK"/>
+        </w:rPr>
+        <w:t xml:space="preserve"> </w:t>
+      </w:r>
+      <w:proofErr w:type="spellStart"/>
+      <w:r>
+        <w:rPr>
+          <w:rFonts w:cs="Times New Roman"/>
+          <w:szCs w:val="24"/>
+          <w:lang w:val="da-DK"/>
+        </w:rPr>
+        <w:t>multi</w:t>
+      </w:r>
+      <w:proofErr w:type="spellEnd"/>
+      <w:r>
+        <w:rPr>
+          <w:rFonts w:cs="Times New Roman"/>
+          <w:szCs w:val="24"/>
+          <w:lang w:val="da-DK"/>
+        </w:rPr>
+        <w:t xml:space="preserve">-component workflow and </w:t>
+      </w:r>
+      <w:proofErr w:type="spellStart"/>
+      <w:r>
+        <w:rPr>
+          <w:rFonts w:cs="Times New Roman"/>
+          <w:szCs w:val="24"/>
+          <w:lang w:val="da-DK"/>
+        </w:rPr>
+        <w:t>involves</w:t>
+      </w:r>
+      <w:proofErr w:type="spellEnd"/>
+      <w:r>
+        <w:rPr>
+          <w:rFonts w:cs="Times New Roman"/>
+          <w:szCs w:val="24"/>
+          <w:lang w:val="da-DK"/>
+        </w:rPr>
+        <w:t xml:space="preserve"> all </w:t>
+      </w:r>
+      <w:proofErr w:type="spellStart"/>
+      <w:r>
+        <w:rPr>
+          <w:rFonts w:cs="Times New Roman"/>
+          <w:szCs w:val="24"/>
+          <w:lang w:val="da-DK"/>
+        </w:rPr>
+        <w:t>three</w:t>
+      </w:r>
+      <w:proofErr w:type="spellEnd"/>
+      <w:r>
+        <w:rPr>
+          <w:rFonts w:cs="Times New Roman"/>
+          <w:szCs w:val="24"/>
+          <w:lang w:val="da-DK"/>
+        </w:rPr>
+        <w:t xml:space="preserve"> </w:t>
+      </w:r>
+      <w:proofErr w:type="spellStart"/>
+      <w:r>
+        <w:rPr>
+          <w:rFonts w:cs="Times New Roman"/>
+          <w:szCs w:val="24"/>
+          <w:lang w:val="da-DK"/>
+        </w:rPr>
+        <w:t>application</w:t>
+      </w:r>
+      <w:proofErr w:type="spellEnd"/>
+      <w:r>
+        <w:rPr>
+          <w:rFonts w:cs="Times New Roman"/>
+          <w:szCs w:val="24"/>
+          <w:lang w:val="da-DK"/>
+        </w:rPr>
+        <w:t xml:space="preserve"> components.</w:t>
+      </w:r>
+    </w:p>
+    <w:p>
+      <w:pPr>
+        <w:spacing w:line="360" w:lineRule="auto"/>
+        <w:rPr>
+          <w:rFonts w:cs="Times New Roman"/>
+          <w:szCs w:val="24"/>
+          <w:lang w:val="da-DK"/>
+        </w:rPr>
+      </w:pPr>
+      <w:r>
+        <w:rPr>
+          <w:rFonts w:cs="Times New Roman"/>
+          <w:szCs w:val="24"/>
+          <w:lang w:val="da-DK"/>
+        </w:rPr>
+        <w:t>The workflow is:</w:t>
+      </w:r>
+    </w:p>
+    <w:p>
+      <w:pPr>
+        <w:spacing w:line="360" w:lineRule="auto"/>
+        <w:rPr>
+          <w:rFonts w:cs="Times New Roman"/>
+          <w:szCs w:val="24"/>
+          <w:lang w:val="da-DK"/>
+        </w:rPr>
+      </w:pPr>
+      <w:r>
+        <w:rPr>
+          <w:rFonts w:cs="Times New Roman"/>
+          <w:b/>
+          <w:bCs/>
+          <w:szCs w:val="24"/>
+          <w:lang w:val="da-DK"/>
+        </w:rPr>
+        <w:t>User → API Service → Processing Service → Resource Service → Processing Service → API Service → User</w:t>
+      </w:r>
+    </w:p>
+    <w:p>
+      <w:pPr>
+        <w:spacing w:line="360" w:lineRule="auto"/>
+        <w:rPr>
+          <w:rFonts w:cs="Times New Roman"/>
+          <w:szCs w:val="24"/>
+          <w:lang w:val="da-DK"/>
+        </w:rPr>
+      </w:pPr>
+      <w:r>
+        <w:rPr>
+          <w:rFonts w:cs="Times New Roman"/>
+          <w:szCs w:val="24"/>
+          <w:lang w:val="da-DK"/>
+        </w:rPr>
+        <w:t xml:space="preserve">The API Service </w:t>
+      </w:r>
+      <w:proofErr w:type="spellStart"/>
+      <w:r>
+        <w:rPr>
+          <w:rFonts w:cs="Times New Roman"/>
+          <w:szCs w:val="24"/>
+          <w:lang w:val="da-DK"/>
+        </w:rPr>
+        <w:t>authenticates</w:t>
+      </w:r>
+      <w:proofErr w:type="spellEnd"/>
+      <w:r>
+        <w:rPr>
+          <w:rFonts w:cs="Times New Roman"/>
+          <w:szCs w:val="24"/>
+          <w:lang w:val="da-DK"/>
+        </w:rPr>
+        <w:t xml:space="preserve"> the </w:t>
+      </w:r>
+      <w:proofErr w:type="spellStart"/>
+      <w:r>
+        <w:rPr>
+          <w:rFonts w:cs="Times New Roman"/>
+          <w:szCs w:val="24"/>
+          <w:lang w:val="da-DK"/>
+        </w:rPr>
+        <w:t>requester</w:t>
+      </w:r>
+      <w:proofErr w:type="spellEnd"/>
+      <w:r>
+        <w:rPr>
+          <w:rFonts w:cs="Times New Roman"/>
+          <w:szCs w:val="24"/>
+          <w:lang w:val="da-DK"/>
+        </w:rPr>
+        <w:t xml:space="preserve"> and </w:t>
+      </w:r>
+      <w:proofErr w:type="spellStart"/>
+      <w:r>
+        <w:rPr>
+          <w:rFonts w:cs="Times New Roman"/>
+          <w:szCs w:val="24"/>
+          <w:lang w:val="da-DK"/>
+        </w:rPr>
+        <w:t>initiates</w:t>
+      </w:r>
+      <w:proofErr w:type="spellEnd"/>
+      <w:r>
+        <w:rPr>
+          <w:rFonts w:cs="Times New Roman"/>
+          <w:szCs w:val="24"/>
+          <w:lang w:val="da-DK"/>
+        </w:rPr>
+        <w:t xml:space="preserve"> the </w:t>
+      </w:r>
+      <w:proofErr w:type="spellStart"/>
+      <w:r>
+        <w:rPr>
+          <w:rFonts w:cs="Times New Roman"/>
+          <w:szCs w:val="24"/>
+          <w:lang w:val="da-DK"/>
+        </w:rPr>
+        <w:t>processing</w:t>
+      </w:r>
+      <w:proofErr w:type="spellEnd"/>
+      <w:r>
+        <w:rPr>
+          <w:rFonts w:cs="Times New Roman"/>
+          <w:szCs w:val="24"/>
+          <w:lang w:val="da-DK"/>
+        </w:rPr>
+        <w:t xml:space="preserve"> operation. The Processing Service </w:t>
+      </w:r>
+      <w:proofErr w:type="spellStart"/>
+      <w:r>
+        <w:rPr>
+          <w:rFonts w:cs="Times New Roman"/>
+          <w:szCs w:val="24"/>
+          <w:lang w:val="da-DK"/>
+        </w:rPr>
+        <w:t>requests</w:t>
+      </w:r>
+      <w:proofErr w:type="spellEnd"/>
+      <w:r>
+        <w:rPr>
+          <w:rFonts w:cs="Times New Roman"/>
+          <w:szCs w:val="24"/>
+          <w:lang w:val="da-DK"/>
+        </w:rPr>
+        <w:t xml:space="preserve"> the </w:t>
+      </w:r>
+      <w:proofErr w:type="spellStart"/>
+      <w:r>
+        <w:rPr>
+          <w:rFonts w:cs="Times New Roman"/>
+          <w:szCs w:val="24"/>
+          <w:lang w:val="da-DK"/>
+        </w:rPr>
+        <w:t>required</w:t>
+      </w:r>
+      <w:proofErr w:type="spellEnd"/>
+      <w:r>
+        <w:rPr>
+          <w:rFonts w:cs="Times New Roman"/>
+          <w:szCs w:val="24"/>
+          <w:lang w:val="da-DK"/>
+        </w:rPr>
+        <w:t xml:space="preserve"> booking information from the Resource Service and </w:t>
+      </w:r>
+      <w:proofErr w:type="spellStart"/>
+      <w:r>
+        <w:rPr>
+          <w:rFonts w:cs="Times New Roman"/>
+          <w:szCs w:val="24"/>
+          <w:lang w:val="da-DK"/>
+        </w:rPr>
+        <w:t>uses</w:t>
+      </w:r>
+      <w:proofErr w:type="spellEnd"/>
+      <w:r>
+        <w:rPr>
+          <w:rFonts w:cs="Times New Roman"/>
+          <w:szCs w:val="24"/>
+          <w:lang w:val="da-DK"/>
+        </w:rPr>
+        <w:t xml:space="preserve"> the </w:t>
+      </w:r>
+      <w:proofErr w:type="spellStart"/>
+      <w:proofErr w:type="gramStart"/>
+      <w:r>
+        <w:rPr>
+          <w:rFonts w:cs="Times New Roman"/>
+          <w:szCs w:val="24"/>
+          <w:lang w:val="da-DK"/>
+        </w:rPr>
+        <w:t>project's</w:t>
+      </w:r>
+      <w:proofErr w:type="spellEnd"/>
+      <w:proofErr w:type="gramEnd"/>
+      <w:r>
+        <w:rPr>
+          <w:rFonts w:cs="Times New Roman"/>
+          <w:szCs w:val="24"/>
+          <w:lang w:val="da-DK"/>
+        </w:rPr>
+        <w:t xml:space="preserve"> </w:t>
+      </w:r>
+      <w:proofErr w:type="spellStart"/>
+      <w:r>
+        <w:rPr>
+          <w:rFonts w:cs="Times New Roman"/>
+          <w:szCs w:val="24"/>
+          <w:lang w:val="da-DK"/>
+        </w:rPr>
+        <w:t>helper</w:t>
+      </w:r>
+      <w:proofErr w:type="spellEnd"/>
+      <w:r>
+        <w:rPr>
+          <w:rFonts w:cs="Times New Roman"/>
+          <w:szCs w:val="24"/>
+          <w:lang w:val="da-DK"/>
+        </w:rPr>
+        <w:t xml:space="preserve"> </w:t>
+      </w:r>
+      <w:proofErr w:type="spellStart"/>
+      <w:r>
+        <w:rPr>
+          <w:rFonts w:cs="Times New Roman"/>
+          <w:szCs w:val="24"/>
+          <w:lang w:val="da-DK"/>
+        </w:rPr>
+        <w:t>package</w:t>
+      </w:r>
+      <w:proofErr w:type="spellEnd"/>
+      <w:r>
+        <w:rPr>
+          <w:rFonts w:cs="Times New Roman"/>
+          <w:szCs w:val="24"/>
+          <w:lang w:val="da-DK"/>
+        </w:rPr>
+        <w:t xml:space="preserve"> to </w:t>
+      </w:r>
+      <w:proofErr w:type="spellStart"/>
+      <w:r>
+        <w:rPr>
+          <w:rFonts w:cs="Times New Roman"/>
+          <w:szCs w:val="24"/>
+          <w:lang w:val="da-DK"/>
+        </w:rPr>
+        <w:t>generate</w:t>
+      </w:r>
+      <w:proofErr w:type="spellEnd"/>
+      <w:r>
+        <w:rPr>
+          <w:rFonts w:cs="Times New Roman"/>
+          <w:szCs w:val="24"/>
+          <w:lang w:val="da-DK"/>
+        </w:rPr>
+        <w:t xml:space="preserve"> the summary.</w:t>
+      </w:r>
+    </w:p>
+    <w:p>
+      <w:pPr>
+        <w:spacing w:line="360" w:lineRule="auto"/>
+        <w:rPr>
+          <w:rFonts w:cs="Times New Roman"/>
+          <w:szCs w:val="24"/>
+          <w:lang w:val="da-DK"/>
+        </w:rPr>
+      </w:pPr>
+      <w:proofErr w:type="spellStart"/>
+      <w:r>
+        <w:rPr>
+          <w:rFonts w:cs="Times New Roman"/>
+          <w:szCs w:val="24"/>
+          <w:lang w:val="da-DK"/>
+        </w:rPr>
+        <w:t>Authorization</w:t>
+      </w:r>
+      <w:proofErr w:type="spellEnd"/>
+      <w:r>
+        <w:rPr>
+          <w:rFonts w:cs="Times New Roman"/>
+          <w:szCs w:val="24"/>
+          <w:lang w:val="da-DK"/>
+        </w:rPr>
+        <w:t xml:space="preserve"> must </w:t>
+      </w:r>
+      <w:proofErr w:type="spellStart"/>
+      <w:r>
+        <w:rPr>
+          <w:rFonts w:cs="Times New Roman"/>
+          <w:szCs w:val="24"/>
+          <w:lang w:val="da-DK"/>
+        </w:rPr>
+        <w:t>be</w:t>
+      </w:r>
+      <w:proofErr w:type="spellEnd"/>
+      <w:r>
+        <w:rPr>
+          <w:rFonts w:cs="Times New Roman"/>
+          <w:szCs w:val="24"/>
+          <w:lang w:val="da-DK"/>
+        </w:rPr>
+        <w:t xml:space="preserve"> </w:t>
+      </w:r>
+      <w:proofErr w:type="spellStart"/>
+      <w:r>
+        <w:rPr>
+          <w:rFonts w:cs="Times New Roman"/>
+          <w:szCs w:val="24"/>
+          <w:lang w:val="da-DK"/>
+        </w:rPr>
+        <w:t>maintained</w:t>
+      </w:r>
+      <w:proofErr w:type="spellEnd"/>
+      <w:r>
+        <w:rPr>
+          <w:rFonts w:cs="Times New Roman"/>
+          <w:szCs w:val="24"/>
+          <w:lang w:val="da-DK"/>
+        </w:rPr>
+        <w:t xml:space="preserve"> </w:t>
+      </w:r>
+      <w:proofErr w:type="spellStart"/>
+      <w:r>
+        <w:rPr>
+          <w:rFonts w:cs="Times New Roman"/>
+          <w:szCs w:val="24"/>
+          <w:lang w:val="da-DK"/>
+        </w:rPr>
+        <w:t>throughout</w:t>
+      </w:r>
+      <w:proofErr w:type="spellEnd"/>
+      <w:r>
+        <w:rPr>
+          <w:rFonts w:cs="Times New Roman"/>
+          <w:szCs w:val="24"/>
+          <w:lang w:val="da-DK"/>
+        </w:rPr>
+        <w:t xml:space="preserve"> </w:t>
+      </w:r>
+      <w:proofErr w:type="spellStart"/>
+      <w:r>
+        <w:rPr>
+          <w:rFonts w:cs="Times New Roman"/>
+          <w:szCs w:val="24"/>
+          <w:lang w:val="da-DK"/>
+        </w:rPr>
+        <w:t>this</w:t>
+      </w:r>
+      <w:proofErr w:type="spellEnd"/>
+      <w:r>
+        <w:rPr>
+          <w:rFonts w:cs="Times New Roman"/>
+          <w:szCs w:val="24"/>
+          <w:lang w:val="da-DK"/>
+        </w:rPr>
+        <w:t xml:space="preserve"> workflow. In </w:t>
+      </w:r>
+      <w:proofErr w:type="spellStart"/>
+      <w:r>
+        <w:rPr>
+          <w:rFonts w:cs="Times New Roman"/>
+          <w:szCs w:val="24"/>
+          <w:lang w:val="da-DK"/>
+        </w:rPr>
+        <w:t>particular</w:t>
+      </w:r>
+      <w:proofErr w:type="spellEnd"/>
+      <w:r>
+        <w:rPr>
+          <w:rFonts w:cs="Times New Roman"/>
+          <w:szCs w:val="24"/>
+          <w:lang w:val="da-DK"/>
+        </w:rPr>
+        <w:t xml:space="preserve">, the Resource Service must </w:t>
+      </w:r>
+      <w:proofErr w:type="spellStart"/>
+      <w:r>
+        <w:rPr>
+          <w:rFonts w:cs="Times New Roman"/>
+          <w:szCs w:val="24"/>
+          <w:lang w:val="da-DK"/>
+        </w:rPr>
+        <w:t>enforce</w:t>
+      </w:r>
+      <w:proofErr w:type="spellEnd"/>
+      <w:r>
+        <w:rPr>
+          <w:rFonts w:cs="Times New Roman"/>
+          <w:szCs w:val="24"/>
+          <w:lang w:val="da-DK"/>
+        </w:rPr>
+        <w:t xml:space="preserve"> </w:t>
+      </w:r>
+      <w:proofErr w:type="spellStart"/>
+      <w:r>
+        <w:rPr>
+          <w:rFonts w:cs="Times New Roman"/>
+          <w:szCs w:val="24"/>
+          <w:lang w:val="da-DK"/>
+        </w:rPr>
+        <w:t>access</w:t>
+      </w:r>
+      <w:proofErr w:type="spellEnd"/>
+      <w:r>
+        <w:rPr>
+          <w:rFonts w:cs="Times New Roman"/>
+          <w:szCs w:val="24"/>
+          <w:lang w:val="da-DK"/>
+        </w:rPr>
+        <w:t xml:space="preserve"> to the </w:t>
+      </w:r>
+      <w:proofErr w:type="spellStart"/>
+      <w:r>
+        <w:rPr>
+          <w:rFonts w:cs="Times New Roman"/>
+          <w:szCs w:val="24"/>
+          <w:lang w:val="da-DK"/>
+        </w:rPr>
+        <w:t>protected</w:t>
+      </w:r>
+      <w:proofErr w:type="spellEnd"/>
+      <w:r>
+        <w:rPr>
+          <w:rFonts w:cs="Times New Roman"/>
+          <w:szCs w:val="24"/>
+          <w:lang w:val="da-DK"/>
+        </w:rPr>
+        <w:t xml:space="preserve"> booking information </w:t>
+      </w:r>
+      <w:proofErr w:type="spellStart"/>
+      <w:r>
+        <w:rPr>
+          <w:rFonts w:cs="Times New Roman"/>
+          <w:szCs w:val="24"/>
+          <w:lang w:val="da-DK"/>
+        </w:rPr>
+        <w:t>rather</w:t>
+      </w:r>
+      <w:proofErr w:type="spellEnd"/>
+      <w:r>
+        <w:rPr>
+          <w:rFonts w:cs="Times New Roman"/>
+          <w:szCs w:val="24"/>
+          <w:lang w:val="da-DK"/>
+        </w:rPr>
+        <w:t xml:space="preserve"> </w:t>
+      </w:r>
+      <w:proofErr w:type="spellStart"/>
+      <w:r>
+        <w:rPr>
+          <w:rFonts w:cs="Times New Roman"/>
+          <w:szCs w:val="24"/>
+          <w:lang w:val="da-DK"/>
+        </w:rPr>
+        <w:t>than</w:t>
+      </w:r>
+      <w:proofErr w:type="spellEnd"/>
+      <w:r>
+        <w:rPr>
+          <w:rFonts w:cs="Times New Roman"/>
+          <w:szCs w:val="24"/>
+          <w:lang w:val="da-DK"/>
+        </w:rPr>
+        <w:t xml:space="preserve"> </w:t>
+      </w:r>
+      <w:proofErr w:type="spellStart"/>
+      <w:r>
+        <w:rPr>
+          <w:rFonts w:cs="Times New Roman"/>
+          <w:szCs w:val="24"/>
+          <w:lang w:val="da-DK"/>
+        </w:rPr>
+        <w:t>assuming</w:t>
+      </w:r>
+      <w:proofErr w:type="spellEnd"/>
+      <w:r>
+        <w:rPr>
+          <w:rFonts w:cs="Times New Roman"/>
+          <w:szCs w:val="24"/>
+          <w:lang w:val="da-DK"/>
+        </w:rPr>
+        <w:t xml:space="preserve"> </w:t>
+      </w:r>
+      <w:proofErr w:type="spellStart"/>
+      <w:r>
+        <w:rPr>
+          <w:rFonts w:cs="Times New Roman"/>
+          <w:szCs w:val="24"/>
+          <w:lang w:val="da-DK"/>
+        </w:rPr>
+        <w:t>that</w:t>
+      </w:r>
+      <w:proofErr w:type="spellEnd"/>
+      <w:r>
+        <w:rPr>
+          <w:rFonts w:cs="Times New Roman"/>
+          <w:szCs w:val="24"/>
+          <w:lang w:val="da-DK"/>
+        </w:rPr>
+        <w:t xml:space="preserve"> a </w:t>
+      </w:r>
+      <w:proofErr w:type="spellStart"/>
+      <w:r>
+        <w:rPr>
+          <w:rFonts w:cs="Times New Roman"/>
+          <w:szCs w:val="24"/>
+          <w:lang w:val="da-DK"/>
+        </w:rPr>
+        <w:t>request</w:t>
+      </w:r>
+      <w:proofErr w:type="spellEnd"/>
+      <w:r>
+        <w:rPr>
+          <w:rFonts w:cs="Times New Roman"/>
+          <w:szCs w:val="24"/>
+          <w:lang w:val="da-DK"/>
+        </w:rPr>
+        <w:t xml:space="preserve"> is </w:t>
+      </w:r>
+      <w:proofErr w:type="spellStart"/>
+      <w:r>
+        <w:rPr>
+          <w:rFonts w:cs="Times New Roman"/>
+          <w:szCs w:val="24"/>
+          <w:lang w:val="da-DK"/>
+        </w:rPr>
+        <w:t>authorized</w:t>
+      </w:r>
+      <w:proofErr w:type="spellEnd"/>
+      <w:r>
+        <w:rPr>
+          <w:rFonts w:cs="Times New Roman"/>
+          <w:szCs w:val="24"/>
+          <w:lang w:val="da-DK"/>
+        </w:rPr>
+        <w:t xml:space="preserve"> </w:t>
+      </w:r>
+      <w:proofErr w:type="spellStart"/>
+      <w:r>
+        <w:rPr>
+          <w:rFonts w:cs="Times New Roman"/>
+          <w:szCs w:val="24"/>
+          <w:lang w:val="da-DK"/>
+        </w:rPr>
+        <w:t>simply</w:t>
+      </w:r>
+      <w:proofErr w:type="spellEnd"/>
+      <w:r>
+        <w:rPr>
+          <w:rFonts w:cs="Times New Roman"/>
+          <w:szCs w:val="24"/>
+          <w:lang w:val="da-DK"/>
+        </w:rPr>
+        <w:t xml:space="preserve"> </w:t>
+      </w:r>
+      <w:proofErr w:type="spellStart"/>
+      <w:r>
+        <w:rPr>
+          <w:rFonts w:cs="Times New Roman"/>
+          <w:szCs w:val="24"/>
+          <w:lang w:val="da-DK"/>
+        </w:rPr>
+        <w:t>because</w:t>
+      </w:r>
+      <w:proofErr w:type="spellEnd"/>
+      <w:r>
+        <w:rPr>
+          <w:rFonts w:cs="Times New Roman"/>
+          <w:szCs w:val="24"/>
+          <w:lang w:val="da-DK"/>
+        </w:rPr>
+        <w:t xml:space="preserve"> it </w:t>
+      </w:r>
+      <w:proofErr w:type="spellStart"/>
+      <w:r>
+        <w:rPr>
+          <w:rFonts w:cs="Times New Roman"/>
+          <w:szCs w:val="24"/>
+          <w:lang w:val="da-DK"/>
+        </w:rPr>
+        <w:t>originated</w:t>
+      </w:r>
+      <w:proofErr w:type="spellEnd"/>
+      <w:r>
+        <w:rPr>
+          <w:rFonts w:cs="Times New Roman"/>
+          <w:szCs w:val="24"/>
+          <w:lang w:val="da-DK"/>
+        </w:rPr>
+        <w:t xml:space="preserve"> from </w:t>
+      </w:r>
+      <w:proofErr w:type="spellStart"/>
+      <w:r>
+        <w:rPr>
+          <w:rFonts w:cs="Times New Roman"/>
+          <w:szCs w:val="24"/>
+          <w:lang w:val="da-DK"/>
+        </w:rPr>
+        <w:t>another</w:t>
+      </w:r>
+      <w:proofErr w:type="spellEnd"/>
+      <w:r>
+        <w:rPr>
+          <w:rFonts w:cs="Times New Roman"/>
+          <w:szCs w:val="24"/>
+          <w:lang w:val="da-DK"/>
+        </w:rPr>
+        <w:t xml:space="preserve"> </w:t>
+      </w:r>
+      <w:proofErr w:type="spellStart"/>
+      <w:r>
+        <w:rPr>
+          <w:rFonts w:cs="Times New Roman"/>
+          <w:szCs w:val="24"/>
+          <w:lang w:val="da-DK"/>
+        </w:rPr>
+        <w:t>application</w:t>
+      </w:r>
+      <w:proofErr w:type="spellEnd"/>
+      <w:r>
+        <w:rPr>
+          <w:rFonts w:cs="Times New Roman"/>
+          <w:szCs w:val="24"/>
+          <w:lang w:val="da-DK"/>
+        </w:rPr>
+        <w:t xml:space="preserve"> component.</w:t>
+      </w:r>
+    </w:p>
+    <w:p>
+      <w:pPr>
+        <w:spacing w:line="360" w:lineRule="auto"/>
+        <w:rPr>
+          <w:rFonts w:cs="Times New Roman"/>
+          <w:szCs w:val="24"/>
+        </w:rPr>
+      </w:pPr>
     </w:p>
     <w:sectPr>
       <w:pgSz w:w="11906" w:h="16838"/>
@@ -2848,7 +5448,7 @@
     <w:rPr>
       <w:rFonts w:ascii="Times New Roman" w:hAnsi="Times New Roman"/>
       <w:sz w:val="24"/>
-      <w:lang w:val="en-US"/>
+      <w:lang w:val="en-GB"/>
     </w:rPr>
   </w:style>
   <w:style w:type="paragraph" w:styleId="Overskrift1">
@@ -3366,6 +5966,25 @@
       <w:spacing w:val="5"/>
     </w:rPr>
   </w:style>
+  <w:style w:type="table" w:styleId="Tabel-Gitter">
+    <w:name w:val="Table Grid"/>
+    <w:basedOn w:val="Tabel-Normal"/>
+    <w:uiPriority w:val="39"/>
+    <w:rsid w:val="00A945E3"/>
+    <w:pPr>
+      <w:spacing w:after="0" w:line="240" w:lineRule="auto"/>
+    </w:pPr>
+    <w:tblPr>
+      <w:tblBorders>
+        <w:top w:val="single" w:sz="4" w:space="0" w:color="auto"/>
+        <w:left w:val="single" w:sz="4" w:space="0" w:color="auto"/>
+        <w:bottom w:val="single" w:sz="4" w:space="0" w:color="auto"/>
+        <w:right w:val="single" w:sz="4" w:space="0" w:color="auto"/>
+        <w:insideH w:val="single" w:sz="4" w:space="0" w:color="auto"/>
+        <w:insideV w:val="single" w:sz="4" w:space="0" w:color="auto"/>
+      </w:tblBorders>
+    </w:tblPr>
+  </w:style>
 </w:styles>
 </file>
 

</xml_diff>

<commit_message>
Implement resource service baseline
</commit_message>
<xml_diff>
--- a/documentation/Security Lifecycle Plan.docx
+++ b/documentation/Security Lifecycle Plan.docx
@@ -87,7 +87,23 @@
           <w:rFonts w:cs="Times New Roman"/>
           <w:szCs w:val="24"/>
         </w:rPr>
-        <w:t>The system uses only synthetic data and seeded user accounts.</w:t>
+        <w:t xml:space="preserve">The system uses only synthetic data and </w:t>
+      </w:r>
+      <w:proofErr w:type="gramStart"/>
+      <w:r>
+        <w:rPr>
+          <w:rFonts w:cs="Times New Roman"/>
+          <w:szCs w:val="24"/>
+        </w:rPr>
+        <w:t>seeded</w:t>
+      </w:r>
+      <w:proofErr w:type="gramEnd"/>
+      <w:r>
+        <w:rPr>
+          <w:rFonts w:cs="Times New Roman"/>
+          <w:szCs w:val="24"/>
+        </w:rPr>
+        <w:t xml:space="preserve"> user accounts.</w:t>
       </w:r>
     </w:p>
     <w:p>
@@ -738,7 +754,22 @@
           <w:szCs w:val="24"/>
         </w:rPr>
         <w:br/>
-        <w:t>Communication between components shall occur through explicit network interfaces.</w:t>
+      </w:r>
+      <w:proofErr w:type="spellStart"/>
+      <w:r>
+        <w:rPr>
+          <w:rFonts w:cs="Times New Roman"/>
+          <w:szCs w:val="24"/>
+        </w:rPr>
+        <w:t>Communication</w:t>
+      </w:r>
+      <w:proofErr w:type="spellEnd"/>
+      <w:r>
+        <w:rPr>
+          <w:rFonts w:cs="Times New Roman"/>
+          <w:szCs w:val="24"/>
+        </w:rPr>
+        <w:t xml:space="preserve"> between components shall occur through explicit network interfaces.</w:t>
       </w:r>
     </w:p>
     <w:p>
@@ -6855,7 +6886,35 @@
                 <w:rFonts w:cs="Times New Roman"/>
                 <w:szCs w:val="24"/>
               </w:rPr>
-              <w:t>An attacker attempts to act as Alice, Bob, or Admin using invalid or manipulated authentication information.</w:t>
+              <w:t xml:space="preserve">An attacker attempts to act as </w:t>
+            </w:r>
+            <w:r>
+              <w:rPr>
+                <w:rFonts w:cs="Times New Roman"/>
+                <w:szCs w:val="24"/>
+              </w:rPr>
+              <w:t>John</w:t>
+            </w:r>
+            <w:r>
+              <w:rPr>
+                <w:rFonts w:cs="Times New Roman"/>
+                <w:szCs w:val="24"/>
+              </w:rPr>
+              <w:t xml:space="preserve">, </w:t>
+            </w:r>
+            <w:r>
+              <w:rPr>
+                <w:rFonts w:cs="Times New Roman"/>
+                <w:szCs w:val="24"/>
+              </w:rPr>
+              <w:t>Doe</w:t>
+            </w:r>
+            <w:r>
+              <w:rPr>
+                <w:rFonts w:cs="Times New Roman"/>
+                <w:szCs w:val="24"/>
+              </w:rPr>
+              <w:t>, or Admin using invalid or manipulated authentication information.</w:t>
             </w:r>
           </w:p>
         </w:tc>
@@ -6945,7 +7004,23 @@
                 <w:rFonts w:cs="Times New Roman"/>
                 <w:szCs w:val="24"/>
               </w:rPr>
-              <w:t>A requester modifies a booking identifier or other security-relevant request data in an attempt to access or alter an unintended booking.</w:t>
+              <w:t xml:space="preserve">A requester modifies a booking identifier or other security-relevant request data </w:t>
+            </w:r>
+            <w:proofErr w:type="gramStart"/>
+            <w:r>
+              <w:rPr>
+                <w:rFonts w:cs="Times New Roman"/>
+                <w:szCs w:val="24"/>
+              </w:rPr>
+              <w:t>in an attempt to</w:t>
+            </w:r>
+            <w:proofErr w:type="gramEnd"/>
+            <w:r>
+              <w:rPr>
+                <w:rFonts w:cs="Times New Roman"/>
+                <w:szCs w:val="24"/>
+              </w:rPr>
+              <w:t xml:space="preserve"> access or alter an unintended booking.</w:t>
             </w:r>
           </w:p>
         </w:tc>
@@ -7125,7 +7200,28 @@
                 <w:rFonts w:cs="Times New Roman"/>
                 <w:szCs w:val="24"/>
               </w:rPr>
-              <w:t>Alice attempts to retrieve Bob's booking information or generated summary.</w:t>
+              <w:t>John</w:t>
+            </w:r>
+            <w:r>
+              <w:rPr>
+                <w:rFonts w:cs="Times New Roman"/>
+                <w:szCs w:val="24"/>
+              </w:rPr>
+              <w:t xml:space="preserve"> attempts to retrieve </w:t>
+            </w:r>
+            <w:r>
+              <w:rPr>
+                <w:rFonts w:cs="Times New Roman"/>
+                <w:szCs w:val="24"/>
+              </w:rPr>
+              <w:t>Doe</w:t>
+            </w:r>
+            <w:r>
+              <w:rPr>
+                <w:rFonts w:cs="Times New Roman"/>
+                <w:szCs w:val="24"/>
+              </w:rPr>
+              <w:t>'s booking information or generated summary.</w:t>
             </w:r>
           </w:p>
         </w:tc>
@@ -7773,7 +7869,28 @@
           <w:rFonts w:cs="Times New Roman"/>
           <w:szCs w:val="24"/>
         </w:rPr>
-        <w:t>Alice and Bob can access only their own protected resources.</w:t>
+        <w:t>John</w:t>
+      </w:r>
+      <w:r>
+        <w:rPr>
+          <w:rFonts w:cs="Times New Roman"/>
+          <w:szCs w:val="24"/>
+        </w:rPr>
+        <w:t xml:space="preserve"> and </w:t>
+      </w:r>
+      <w:r>
+        <w:rPr>
+          <w:rFonts w:cs="Times New Roman"/>
+          <w:szCs w:val="24"/>
+        </w:rPr>
+        <w:t>Doe</w:t>
+      </w:r>
+      <w:r>
+        <w:rPr>
+          <w:rFonts w:cs="Times New Roman"/>
+          <w:szCs w:val="24"/>
+        </w:rPr>
+        <w:t xml:space="preserve"> can access only their own protected resources.</w:t>
       </w:r>
     </w:p>
     <w:p>
@@ -7792,7 +7909,23 @@
           <w:rFonts w:cs="Times New Roman"/>
           <w:szCs w:val="24"/>
         </w:rPr>
-        <w:t>Administrator privileges are restricted to the Admin role.</w:t>
+        <w:t xml:space="preserve">Administrator privileges are restricted to the </w:t>
+      </w:r>
+      <w:proofErr w:type="gramStart"/>
+      <w:r>
+        <w:rPr>
+          <w:rFonts w:cs="Times New Roman"/>
+          <w:szCs w:val="24"/>
+        </w:rPr>
+        <w:t>Admin</w:t>
+      </w:r>
+      <w:proofErr w:type="gramEnd"/>
+      <w:r>
+        <w:rPr>
+          <w:rFonts w:cs="Times New Roman"/>
+          <w:szCs w:val="24"/>
+        </w:rPr>
+        <w:t xml:space="preserve"> role.</w:t>
       </w:r>
     </w:p>
     <w:p>
@@ -7881,7 +8014,28 @@
           <w:rFonts w:cs="Times New Roman"/>
           <w:szCs w:val="24"/>
         </w:rPr>
-        <w:t>Alice cannot access Bob's protected bookings.</w:t>
+        <w:t>John</w:t>
+      </w:r>
+      <w:r>
+        <w:rPr>
+          <w:rFonts w:cs="Times New Roman"/>
+          <w:szCs w:val="24"/>
+        </w:rPr>
+        <w:t xml:space="preserve"> cannot access </w:t>
+      </w:r>
+      <w:r>
+        <w:rPr>
+          <w:rFonts w:cs="Times New Roman"/>
+          <w:szCs w:val="24"/>
+        </w:rPr>
+        <w:t>Doe</w:t>
+      </w:r>
+      <w:r>
+        <w:rPr>
+          <w:rFonts w:cs="Times New Roman"/>
+          <w:szCs w:val="24"/>
+        </w:rPr>
+        <w:t>'s protected bookings.</w:t>
       </w:r>
     </w:p>
     <w:p>
@@ -7900,7 +8054,28 @@
           <w:rFonts w:cs="Times New Roman"/>
           <w:szCs w:val="24"/>
         </w:rPr>
-        <w:t>Bob cannot access Alice's protected bookings.</w:t>
+        <w:t>Doe</w:t>
+      </w:r>
+      <w:r>
+        <w:rPr>
+          <w:rFonts w:cs="Times New Roman"/>
+          <w:szCs w:val="24"/>
+        </w:rPr>
+        <w:t xml:space="preserve"> cannot access </w:t>
+      </w:r>
+      <w:r>
+        <w:rPr>
+          <w:rFonts w:cs="Times New Roman"/>
+          <w:szCs w:val="24"/>
+        </w:rPr>
+        <w:t>John</w:t>
+      </w:r>
+      <w:r>
+        <w:rPr>
+          <w:rFonts w:cs="Times New Roman"/>
+          <w:szCs w:val="24"/>
+        </w:rPr>
+        <w:t>'s protected bookings.</w:t>
       </w:r>
     </w:p>
     <w:p>
@@ -9198,7 +9373,35 @@
           <w:rFonts w:cs="Times New Roman"/>
           <w:szCs w:val="24"/>
         </w:rPr>
-        <w:t>Testing will use only the seeded Alice, Bob and Admin accounts and synthetic booking data.</w:t>
+        <w:t xml:space="preserve">Testing will use only the seeded </w:t>
+      </w:r>
+      <w:r>
+        <w:rPr>
+          <w:rFonts w:cs="Times New Roman"/>
+          <w:szCs w:val="24"/>
+        </w:rPr>
+        <w:t>John</w:t>
+      </w:r>
+      <w:r>
+        <w:rPr>
+          <w:rFonts w:cs="Times New Roman"/>
+          <w:szCs w:val="24"/>
+        </w:rPr>
+        <w:t xml:space="preserve">, </w:t>
+      </w:r>
+      <w:r>
+        <w:rPr>
+          <w:rFonts w:cs="Times New Roman"/>
+          <w:szCs w:val="24"/>
+        </w:rPr>
+        <w:t>Doe</w:t>
+      </w:r>
+      <w:r>
+        <w:rPr>
+          <w:rFonts w:cs="Times New Roman"/>
+          <w:szCs w:val="24"/>
+        </w:rPr>
+        <w:t xml:space="preserve"> and Admin accounts and synthetic booking data.</w:t>
       </w:r>
     </w:p>
     <w:p>
@@ -9429,7 +9632,28 @@
           <w:rFonts w:cs="Times New Roman"/>
           <w:szCs w:val="24"/>
         </w:rPr>
-        <w:t>Alice can access Alice's bookings.</w:t>
+        <w:t>John</w:t>
+      </w:r>
+      <w:r>
+        <w:rPr>
+          <w:rFonts w:cs="Times New Roman"/>
+          <w:szCs w:val="24"/>
+        </w:rPr>
+        <w:t xml:space="preserve"> can access </w:t>
+      </w:r>
+      <w:r>
+        <w:rPr>
+          <w:rFonts w:cs="Times New Roman"/>
+          <w:szCs w:val="24"/>
+        </w:rPr>
+        <w:t>John</w:t>
+      </w:r>
+      <w:r>
+        <w:rPr>
+          <w:rFonts w:cs="Times New Roman"/>
+          <w:szCs w:val="24"/>
+        </w:rPr>
+        <w:t>'s bookings.</w:t>
       </w:r>
     </w:p>
     <w:p>
@@ -9448,7 +9672,28 @@
           <w:rFonts w:cs="Times New Roman"/>
           <w:szCs w:val="24"/>
         </w:rPr>
-        <w:t>Alice cannot access Bob's bookings.</w:t>
+        <w:t>John</w:t>
+      </w:r>
+      <w:r>
+        <w:rPr>
+          <w:rFonts w:cs="Times New Roman"/>
+          <w:szCs w:val="24"/>
+        </w:rPr>
+        <w:t xml:space="preserve"> cannot access </w:t>
+      </w:r>
+      <w:r>
+        <w:rPr>
+          <w:rFonts w:cs="Times New Roman"/>
+          <w:szCs w:val="24"/>
+        </w:rPr>
+        <w:t>Doe</w:t>
+      </w:r>
+      <w:r>
+        <w:rPr>
+          <w:rFonts w:cs="Times New Roman"/>
+          <w:szCs w:val="24"/>
+        </w:rPr>
+        <w:t>'s bookings.</w:t>
       </w:r>
     </w:p>
     <w:p>
@@ -9467,7 +9712,28 @@
           <w:rFonts w:cs="Times New Roman"/>
           <w:szCs w:val="24"/>
         </w:rPr>
-        <w:t>Bob can access Bob's bookings.</w:t>
+        <w:t>Doe</w:t>
+      </w:r>
+      <w:r>
+        <w:rPr>
+          <w:rFonts w:cs="Times New Roman"/>
+          <w:szCs w:val="24"/>
+        </w:rPr>
+        <w:t xml:space="preserve"> can access </w:t>
+      </w:r>
+      <w:r>
+        <w:rPr>
+          <w:rFonts w:cs="Times New Roman"/>
+          <w:szCs w:val="24"/>
+        </w:rPr>
+        <w:t>Doe</w:t>
+      </w:r>
+      <w:r>
+        <w:rPr>
+          <w:rFonts w:cs="Times New Roman"/>
+          <w:szCs w:val="24"/>
+        </w:rPr>
+        <w:t>'s bookings.</w:t>
       </w:r>
     </w:p>
     <w:p>
@@ -9486,7 +9752,28 @@
           <w:rFonts w:cs="Times New Roman"/>
           <w:szCs w:val="24"/>
         </w:rPr>
-        <w:t>Bob cannot access Alice's bookings.</w:t>
+        <w:t>Doe</w:t>
+      </w:r>
+      <w:r>
+        <w:rPr>
+          <w:rFonts w:cs="Times New Roman"/>
+          <w:szCs w:val="24"/>
+        </w:rPr>
+        <w:t xml:space="preserve"> cannot access </w:t>
+      </w:r>
+      <w:r>
+        <w:rPr>
+          <w:rFonts w:cs="Times New Roman"/>
+          <w:szCs w:val="24"/>
+        </w:rPr>
+        <w:t>John</w:t>
+      </w:r>
+      <w:r>
+        <w:rPr>
+          <w:rFonts w:cs="Times New Roman"/>
+          <w:szCs w:val="24"/>
+        </w:rPr>
+        <w:t>'s bookings.</w:t>
       </w:r>
     </w:p>
     <w:p>
@@ -10259,16 +10546,14 @@
           <w:b/>
           <w:bCs/>
           <w:szCs w:val="24"/>
-          <w:lang w:val="da-DK"/>
-        </w:rPr>
-      </w:pPr>
-      <w:r>
-        <w:rPr>
-          <w:rFonts w:cs="Times New Roman"/>
-          <w:b/>
-          <w:bCs/>
-          <w:szCs w:val="24"/>
-          <w:lang w:val="da-DK"/>
+        </w:rPr>
+      </w:pPr>
+      <w:r>
+        <w:rPr>
+          <w:rFonts w:cs="Times New Roman"/>
+          <w:b/>
+          <w:bCs/>
+          <w:szCs w:val="24"/>
         </w:rPr>
         <w:lastRenderedPageBreak/>
         <w:t>10. Release, Deployment and Operation Plan</w:t>
@@ -10281,16 +10566,14 @@
           <w:b/>
           <w:bCs/>
           <w:szCs w:val="24"/>
-          <w:lang w:val="da-DK"/>
-        </w:rPr>
-      </w:pPr>
-      <w:r>
-        <w:rPr>
-          <w:rFonts w:cs="Times New Roman"/>
-          <w:b/>
-          <w:bCs/>
-          <w:szCs w:val="24"/>
-          <w:lang w:val="da-DK"/>
+        </w:rPr>
+      </w:pPr>
+      <w:r>
+        <w:rPr>
+          <w:rFonts w:cs="Times New Roman"/>
+          <w:b/>
+          <w:bCs/>
+          <w:szCs w:val="24"/>
         </w:rPr>
         <w:t>10.1 Assignment Environment</w:t>
       </w:r>
@@ -10300,14 +10583,12 @@
         <w:rPr>
           <w:rFonts w:cs="Times New Roman"/>
           <w:szCs w:val="24"/>
-          <w:lang w:val="da-DK"/>
-        </w:rPr>
-      </w:pPr>
-      <w:r>
-        <w:rPr>
-          <w:rFonts w:cs="Times New Roman"/>
-          <w:szCs w:val="24"/>
-          <w:lang w:val="da-DK"/>
+        </w:rPr>
+      </w:pPr>
+      <w:r>
+        <w:rPr>
+          <w:rFonts w:cs="Times New Roman"/>
+          <w:szCs w:val="24"/>
         </w:rPr>
         <w:t>The Booking Management System is developed as a local educational application using synthetic users and booking data.</w:t>
       </w:r>
@@ -10317,14 +10598,12 @@
         <w:rPr>
           <w:rFonts w:cs="Times New Roman"/>
           <w:szCs w:val="24"/>
-          <w:lang w:val="da-DK"/>
-        </w:rPr>
-      </w:pPr>
-      <w:r>
-        <w:rPr>
-          <w:rFonts w:cs="Times New Roman"/>
-          <w:szCs w:val="24"/>
-          <w:lang w:val="da-DK"/>
+        </w:rPr>
+      </w:pPr>
+      <w:r>
+        <w:rPr>
+          <w:rFonts w:cs="Times New Roman"/>
+          <w:szCs w:val="24"/>
         </w:rPr>
         <w:t>Public deployment is outside the scope of the assignment. The application will therefore be executed locally or in an isolated test environment for development, security analysis and automated testing.</w:t>
       </w:r>
@@ -10336,16 +10615,14 @@
           <w:b/>
           <w:bCs/>
           <w:szCs w:val="24"/>
-          <w:lang w:val="da-DK"/>
-        </w:rPr>
-      </w:pPr>
-      <w:r>
-        <w:rPr>
-          <w:rFonts w:cs="Times New Roman"/>
-          <w:b/>
-          <w:bCs/>
-          <w:szCs w:val="24"/>
-          <w:lang w:val="da-DK"/>
+        </w:rPr>
+      </w:pPr>
+      <w:r>
+        <w:rPr>
+          <w:rFonts w:cs="Times New Roman"/>
+          <w:b/>
+          <w:bCs/>
+          <w:szCs w:val="24"/>
         </w:rPr>
         <w:t>10.2 Release Requirements</w:t>
       </w:r>
@@ -10355,14 +10632,12 @@
         <w:rPr>
           <w:rFonts w:cs="Times New Roman"/>
           <w:szCs w:val="24"/>
-          <w:lang w:val="da-DK"/>
-        </w:rPr>
-      </w:pPr>
-      <w:r>
-        <w:rPr>
-          <w:rFonts w:cs="Times New Roman"/>
-          <w:szCs w:val="24"/>
-          <w:lang w:val="da-DK"/>
+        </w:rPr>
+      </w:pPr>
+      <w:r>
+        <w:rPr>
+          <w:rFonts w:cs="Times New Roman"/>
+          <w:szCs w:val="24"/>
         </w:rPr>
         <w:t>Before a version of the application is considered suitable for release, the following conditions must be satisfied:</w:t>
       </w:r>
@@ -10376,14 +10651,12 @@
         <w:rPr>
           <w:rFonts w:cs="Times New Roman"/>
           <w:szCs w:val="24"/>
-          <w:lang w:val="da-DK"/>
-        </w:rPr>
-      </w:pPr>
-      <w:r>
-        <w:rPr>
-          <w:rFonts w:cs="Times New Roman"/>
-          <w:szCs w:val="24"/>
-          <w:lang w:val="da-DK"/>
+        </w:rPr>
+      </w:pPr>
+      <w:r>
+        <w:rPr>
+          <w:rFonts w:cs="Times New Roman"/>
+          <w:szCs w:val="24"/>
         </w:rPr>
         <w:t>All three application components start and communicate correctly.</w:t>
       </w:r>
@@ -10397,14 +10670,12 @@
         <w:rPr>
           <w:rFonts w:cs="Times New Roman"/>
           <w:szCs w:val="24"/>
-          <w:lang w:val="da-DK"/>
-        </w:rPr>
-      </w:pPr>
-      <w:r>
-        <w:rPr>
-          <w:rFonts w:cs="Times New Roman"/>
-          <w:szCs w:val="24"/>
-          <w:lang w:val="da-DK"/>
+        </w:rPr>
+      </w:pPr>
+      <w:r>
+        <w:rPr>
+          <w:rFonts w:cs="Times New Roman"/>
+          <w:szCs w:val="24"/>
         </w:rPr>
         <w:t>Required functional tests pass.</w:t>
       </w:r>
@@ -10418,14 +10689,12 @@
         <w:rPr>
           <w:rFonts w:cs="Times New Roman"/>
           <w:szCs w:val="24"/>
-          <w:lang w:val="da-DK"/>
-        </w:rPr>
-      </w:pPr>
-      <w:r>
-        <w:rPr>
-          <w:rFonts w:cs="Times New Roman"/>
-          <w:szCs w:val="24"/>
-          <w:lang w:val="da-DK"/>
+        </w:rPr>
+      </w:pPr>
+      <w:r>
+        <w:rPr>
+          <w:rFonts w:cs="Times New Roman"/>
+          <w:szCs w:val="24"/>
         </w:rPr>
         <w:t>Authentication and authorization tests pass.</w:t>
       </w:r>
@@ -10439,14 +10708,12 @@
         <w:rPr>
           <w:rFonts w:cs="Times New Roman"/>
           <w:szCs w:val="24"/>
-          <w:lang w:val="da-DK"/>
-        </w:rPr>
-      </w:pPr>
-      <w:r>
-        <w:rPr>
-          <w:rFonts w:cs="Times New Roman"/>
-          <w:szCs w:val="24"/>
-          <w:lang w:val="da-DK"/>
+        </w:rPr>
+      </w:pPr>
+      <w:r>
+        <w:rPr>
+          <w:rFonts w:cs="Times New Roman"/>
+          <w:szCs w:val="24"/>
         </w:rPr>
         <w:t>The access-control rules defined in the lifecycle plan are enforced.</w:t>
       </w:r>
@@ -10460,14 +10727,12 @@
         <w:rPr>
           <w:rFonts w:cs="Times New Roman"/>
           <w:szCs w:val="24"/>
-          <w:lang w:val="da-DK"/>
-        </w:rPr>
-      </w:pPr>
-      <w:r>
-        <w:rPr>
-          <w:rFonts w:cs="Times New Roman"/>
-          <w:szCs w:val="24"/>
-          <w:lang w:val="da-DK"/>
+        </w:rPr>
+      </w:pPr>
+      <w:r>
+        <w:rPr>
+          <w:rFonts w:cs="Times New Roman"/>
+          <w:szCs w:val="24"/>
         </w:rPr>
         <w:t>Confirmed security findings that violate required security guarantees are corrected.</w:t>
       </w:r>
@@ -10481,14 +10746,12 @@
         <w:rPr>
           <w:rFonts w:cs="Times New Roman"/>
           <w:szCs w:val="24"/>
-          <w:lang w:val="da-DK"/>
-        </w:rPr>
-      </w:pPr>
-      <w:r>
-        <w:rPr>
-          <w:rFonts w:cs="Times New Roman"/>
-          <w:szCs w:val="24"/>
-          <w:lang w:val="da-DK"/>
+        </w:rPr>
+      </w:pPr>
+      <w:r>
+        <w:rPr>
+          <w:rFonts w:cs="Times New Roman"/>
+          <w:szCs w:val="24"/>
         </w:rPr>
         <w:t>Required dependencies are explicitly declared.</w:t>
       </w:r>
@@ -10502,14 +10765,12 @@
         <w:rPr>
           <w:rFonts w:cs="Times New Roman"/>
           <w:szCs w:val="24"/>
-          <w:lang w:val="da-DK"/>
-        </w:rPr>
-      </w:pPr>
-      <w:r>
-        <w:rPr>
-          <w:rFonts w:cs="Times New Roman"/>
-          <w:szCs w:val="24"/>
-          <w:lang w:val="da-DK"/>
+        </w:rPr>
+      </w:pPr>
+      <w:r>
+        <w:rPr>
+          <w:rFonts w:cs="Times New Roman"/>
+          <w:szCs w:val="24"/>
         </w:rPr>
         <w:t>Static and dependency analysis have completed successfully according to the defined release gates.</w:t>
       </w:r>
@@ -10523,14 +10784,12 @@
         <w:rPr>
           <w:rFonts w:cs="Times New Roman"/>
           <w:szCs w:val="24"/>
-          <w:lang w:val="da-DK"/>
-        </w:rPr>
-      </w:pPr>
-      <w:r>
-        <w:rPr>
-          <w:rFonts w:cs="Times New Roman"/>
-          <w:szCs w:val="24"/>
-          <w:lang w:val="da-DK"/>
+        </w:rPr>
+      </w:pPr>
+      <w:r>
+        <w:rPr>
+          <w:rFonts w:cs="Times New Roman"/>
+          <w:szCs w:val="24"/>
         </w:rPr>
         <w:t>Required test and analysis artifacts have been generated.</w:t>
       </w:r>
@@ -10540,14 +10799,12 @@
         <w:rPr>
           <w:rFonts w:cs="Times New Roman"/>
           <w:szCs w:val="24"/>
-          <w:lang w:val="da-DK"/>
-        </w:rPr>
-      </w:pPr>
-      <w:r>
-        <w:rPr>
-          <w:rFonts w:cs="Times New Roman"/>
-          <w:szCs w:val="24"/>
-          <w:lang w:val="da-DK"/>
+        </w:rPr>
+      </w:pPr>
+      <w:r>
+        <w:rPr>
+          <w:rFonts w:cs="Times New Roman"/>
+          <w:szCs w:val="24"/>
         </w:rPr>
         <w:t>A failed release-blocking condition in the Jenkins pipeline prevents the version from being considered releasable.</w:t>
       </w:r>
@@ -10559,16 +10816,14 @@
           <w:b/>
           <w:bCs/>
           <w:szCs w:val="24"/>
-          <w:lang w:val="da-DK"/>
-        </w:rPr>
-      </w:pPr>
-      <w:r>
-        <w:rPr>
-          <w:rFonts w:cs="Times New Roman"/>
-          <w:b/>
-          <w:bCs/>
-          <w:szCs w:val="24"/>
-          <w:lang w:val="da-DK"/>
+        </w:rPr>
+      </w:pPr>
+      <w:r>
+        <w:rPr>
+          <w:rFonts w:cs="Times New Roman"/>
+          <w:b/>
+          <w:bCs/>
+          <w:szCs w:val="24"/>
         </w:rPr>
         <w:t>10.3 Production Deployment Considerations</w:t>
       </w:r>
@@ -10578,14 +10833,12 @@
         <w:rPr>
           <w:rFonts w:cs="Times New Roman"/>
           <w:szCs w:val="24"/>
-          <w:lang w:val="da-DK"/>
-        </w:rPr>
-      </w:pPr>
-      <w:r>
-        <w:rPr>
-          <w:rFonts w:cs="Times New Roman"/>
-          <w:szCs w:val="24"/>
-          <w:lang w:val="da-DK"/>
+        </w:rPr>
+      </w:pPr>
+      <w:r>
+        <w:rPr>
+          <w:rFonts w:cs="Times New Roman"/>
+          <w:szCs w:val="24"/>
         </w:rPr>
         <w:t>Although production deployment is outside the scope of this assignment, a real deployment would require additional security controls.</w:t>
       </w:r>
@@ -10595,14 +10848,12 @@
         <w:rPr>
           <w:rFonts w:cs="Times New Roman"/>
           <w:szCs w:val="24"/>
-          <w:lang w:val="da-DK"/>
-        </w:rPr>
-      </w:pPr>
-      <w:r>
-        <w:rPr>
-          <w:rFonts w:cs="Times New Roman"/>
-          <w:szCs w:val="24"/>
-          <w:lang w:val="da-DK"/>
+        </w:rPr>
+      </w:pPr>
+      <w:r>
+        <w:rPr>
+          <w:rFonts w:cs="Times New Roman"/>
+          <w:szCs w:val="24"/>
         </w:rPr>
         <w:t>These would include:</w:t>
       </w:r>
@@ -10616,14 +10867,12 @@
         <w:rPr>
           <w:rFonts w:cs="Times New Roman"/>
           <w:szCs w:val="24"/>
-          <w:lang w:val="da-DK"/>
-        </w:rPr>
-      </w:pPr>
-      <w:r>
-        <w:rPr>
-          <w:rFonts w:cs="Times New Roman"/>
-          <w:szCs w:val="24"/>
-          <w:lang w:val="da-DK"/>
+        </w:rPr>
+      </w:pPr>
+      <w:r>
+        <w:rPr>
+          <w:rFonts w:cs="Times New Roman"/>
+          <w:szCs w:val="24"/>
         </w:rPr>
         <w:t>HTTPS/TLS for communication between users and services.</w:t>
       </w:r>
@@ -10637,14 +10886,12 @@
         <w:rPr>
           <w:rFonts w:cs="Times New Roman"/>
           <w:szCs w:val="24"/>
-          <w:lang w:val="da-DK"/>
-        </w:rPr>
-      </w:pPr>
-      <w:r>
-        <w:rPr>
-          <w:rFonts w:cs="Times New Roman"/>
-          <w:szCs w:val="24"/>
-          <w:lang w:val="da-DK"/>
+        </w:rPr>
+      </w:pPr>
+      <w:r>
+        <w:rPr>
+          <w:rFonts w:cs="Times New Roman"/>
+          <w:szCs w:val="24"/>
         </w:rPr>
         <w:t>Secure management of credentials, tokens and other secrets.</w:t>
       </w:r>
@@ -10658,14 +10905,12 @@
         <w:rPr>
           <w:rFonts w:cs="Times New Roman"/>
           <w:szCs w:val="24"/>
-          <w:lang w:val="da-DK"/>
-        </w:rPr>
-      </w:pPr>
-      <w:r>
-        <w:rPr>
-          <w:rFonts w:cs="Times New Roman"/>
-          <w:szCs w:val="24"/>
-          <w:lang w:val="da-DK"/>
+        </w:rPr>
+      </w:pPr>
+      <w:r>
+        <w:rPr>
+          <w:rFonts w:cs="Times New Roman"/>
+          <w:szCs w:val="24"/>
         </w:rPr>
         <w:t>Stronger production authentication and session management.</w:t>
       </w:r>
@@ -10679,14 +10924,12 @@
         <w:rPr>
           <w:rFonts w:cs="Times New Roman"/>
           <w:szCs w:val="24"/>
-          <w:lang w:val="da-DK"/>
-        </w:rPr>
-      </w:pPr>
-      <w:r>
-        <w:rPr>
-          <w:rFonts w:cs="Times New Roman"/>
-          <w:szCs w:val="24"/>
-          <w:lang w:val="da-DK"/>
+        </w:rPr>
+      </w:pPr>
+      <w:r>
+        <w:rPr>
+          <w:rFonts w:cs="Times New Roman"/>
+          <w:szCs w:val="24"/>
         </w:rPr>
         <w:t>Network restrictions between application components.</w:t>
       </w:r>
@@ -10700,14 +10943,12 @@
         <w:rPr>
           <w:rFonts w:cs="Times New Roman"/>
           <w:szCs w:val="24"/>
-          <w:lang w:val="da-DK"/>
-        </w:rPr>
-      </w:pPr>
-      <w:r>
-        <w:rPr>
-          <w:rFonts w:cs="Times New Roman"/>
-          <w:szCs w:val="24"/>
-          <w:lang w:val="da-DK"/>
+        </w:rPr>
+      </w:pPr>
+      <w:r>
+        <w:rPr>
+          <w:rFonts w:cs="Times New Roman"/>
+          <w:szCs w:val="24"/>
         </w:rPr>
         <w:t>Secure configuration of the services and their runtime environments.</w:t>
       </w:r>
@@ -10721,14 +10962,12 @@
         <w:rPr>
           <w:rFonts w:cs="Times New Roman"/>
           <w:szCs w:val="24"/>
-          <w:lang w:val="da-DK"/>
-        </w:rPr>
-      </w:pPr>
-      <w:r>
-        <w:rPr>
-          <w:rFonts w:cs="Times New Roman"/>
-          <w:szCs w:val="24"/>
-          <w:lang w:val="da-DK"/>
+        </w:rPr>
+      </w:pPr>
+      <w:r>
+        <w:rPr>
+          <w:rFonts w:cs="Times New Roman"/>
+          <w:szCs w:val="24"/>
         </w:rPr>
         <w:t>Appropriate database access controls and protection of stored data.</w:t>
       </w:r>
@@ -10742,14 +10981,12 @@
         <w:rPr>
           <w:rFonts w:cs="Times New Roman"/>
           <w:szCs w:val="24"/>
-          <w:lang w:val="da-DK"/>
-        </w:rPr>
-      </w:pPr>
-      <w:r>
-        <w:rPr>
-          <w:rFonts w:cs="Times New Roman"/>
-          <w:szCs w:val="24"/>
-          <w:lang w:val="da-DK"/>
+        </w:rPr>
+      </w:pPr>
+      <w:r>
+        <w:rPr>
+          <w:rFonts w:cs="Times New Roman"/>
+          <w:szCs w:val="24"/>
         </w:rPr>
         <w:t>Centralized security logging and monitoring.</w:t>
       </w:r>
@@ -10763,14 +11000,12 @@
         <w:rPr>
           <w:rFonts w:cs="Times New Roman"/>
           <w:szCs w:val="24"/>
-          <w:lang w:val="da-DK"/>
-        </w:rPr>
-      </w:pPr>
-      <w:r>
-        <w:rPr>
-          <w:rFonts w:cs="Times New Roman"/>
-          <w:szCs w:val="24"/>
-          <w:lang w:val="da-DK"/>
+        </w:rPr>
+      </w:pPr>
+      <w:r>
+        <w:rPr>
+          <w:rFonts w:cs="Times New Roman"/>
+          <w:szCs w:val="24"/>
         </w:rPr>
         <w:lastRenderedPageBreak/>
         <w:t>Dependency and security update procedures.</w:t>
@@ -10785,14 +11020,12 @@
         <w:rPr>
           <w:rFonts w:cs="Times New Roman"/>
           <w:szCs w:val="24"/>
-          <w:lang w:val="da-DK"/>
-        </w:rPr>
-      </w:pPr>
-      <w:r>
-        <w:rPr>
-          <w:rFonts w:cs="Times New Roman"/>
-          <w:szCs w:val="24"/>
-          <w:lang w:val="da-DK"/>
+        </w:rPr>
+      </w:pPr>
+      <w:r>
+        <w:rPr>
+          <w:rFonts w:cs="Times New Roman"/>
+          <w:szCs w:val="24"/>
         </w:rPr>
         <w:t>Backup and recovery procedures.</w:t>
       </w:r>
@@ -10806,14 +11039,12 @@
         <w:rPr>
           <w:rFonts w:cs="Times New Roman"/>
           <w:szCs w:val="24"/>
-          <w:lang w:val="da-DK"/>
-        </w:rPr>
-      </w:pPr>
-      <w:r>
-        <w:rPr>
-          <w:rFonts w:cs="Times New Roman"/>
-          <w:szCs w:val="24"/>
-          <w:lang w:val="da-DK"/>
+        </w:rPr>
+      </w:pPr>
+      <w:r>
+        <w:rPr>
+          <w:rFonts w:cs="Times New Roman"/>
+          <w:szCs w:val="24"/>
         </w:rPr>
         <w:t>Controlled deployment and rollback procedures.</w:t>
       </w:r>
@@ -10825,16 +11056,14 @@
           <w:b/>
           <w:bCs/>
           <w:szCs w:val="24"/>
-          <w:lang w:val="da-DK"/>
-        </w:rPr>
-      </w:pPr>
-      <w:r>
-        <w:rPr>
-          <w:rFonts w:cs="Times New Roman"/>
-          <w:b/>
-          <w:bCs/>
-          <w:szCs w:val="24"/>
-          <w:lang w:val="da-DK"/>
+        </w:rPr>
+      </w:pPr>
+      <w:r>
+        <w:rPr>
+          <w:rFonts w:cs="Times New Roman"/>
+          <w:b/>
+          <w:bCs/>
+          <w:szCs w:val="24"/>
         </w:rPr>
         <w:t>10.4 Operational Security</w:t>
       </w:r>
@@ -10844,14 +11073,12 @@
         <w:rPr>
           <w:rFonts w:cs="Times New Roman"/>
           <w:szCs w:val="24"/>
-          <w:lang w:val="da-DK"/>
-        </w:rPr>
-      </w:pPr>
-      <w:r>
-        <w:rPr>
-          <w:rFonts w:cs="Times New Roman"/>
-          <w:szCs w:val="24"/>
-          <w:lang w:val="da-DK"/>
+        </w:rPr>
+      </w:pPr>
+      <w:r>
+        <w:rPr>
+          <w:rFonts w:cs="Times New Roman"/>
+          <w:szCs w:val="24"/>
         </w:rPr>
         <w:t>In a production environment, logs and monitoring should be used to identify authentication failures, authorization failures and unexpected application behaviour.</w:t>
       </w:r>
@@ -10861,14 +11088,12 @@
         <w:rPr>
           <w:rFonts w:cs="Times New Roman"/>
           <w:szCs w:val="24"/>
-          <w:lang w:val="da-DK"/>
-        </w:rPr>
-      </w:pPr>
-      <w:r>
-        <w:rPr>
-          <w:rFonts w:cs="Times New Roman"/>
-          <w:szCs w:val="24"/>
-          <w:lang w:val="da-DK"/>
+        </w:rPr>
+      </w:pPr>
+      <w:r>
+        <w:rPr>
+          <w:rFonts w:cs="Times New Roman"/>
+          <w:szCs w:val="24"/>
         </w:rPr>
         <w:t>Dependencies should be periodically reviewed for known vulnerabilities, and security updates should be tested before deployment.</w:t>
       </w:r>
@@ -10878,14 +11103,12 @@
         <w:rPr>
           <w:rFonts w:cs="Times New Roman"/>
           <w:szCs w:val="24"/>
-          <w:lang w:val="da-DK"/>
-        </w:rPr>
-      </w:pPr>
-      <w:r>
-        <w:rPr>
-          <w:rFonts w:cs="Times New Roman"/>
-          <w:szCs w:val="24"/>
-          <w:lang w:val="da-DK"/>
+        </w:rPr>
+      </w:pPr>
+      <w:r>
+        <w:rPr>
+          <w:rFonts w:cs="Times New Roman"/>
+          <w:szCs w:val="24"/>
         </w:rPr>
         <w:t>Changes affecting authentication, authorization, component boundaries or protected resources should require renewed security testing.</w:t>
       </w:r>
@@ -10897,16 +11120,14 @@
           <w:b/>
           <w:bCs/>
           <w:szCs w:val="24"/>
-          <w:lang w:val="da-DK"/>
-        </w:rPr>
-      </w:pPr>
-      <w:r>
-        <w:rPr>
-          <w:rFonts w:cs="Times New Roman"/>
-          <w:b/>
-          <w:bCs/>
-          <w:szCs w:val="24"/>
-          <w:lang w:val="da-DK"/>
+        </w:rPr>
+      </w:pPr>
+      <w:r>
+        <w:rPr>
+          <w:rFonts w:cs="Times New Roman"/>
+          <w:b/>
+          <w:bCs/>
+          <w:szCs w:val="24"/>
         </w:rPr>
         <w:t>10.5 Final Evidence</w:t>
       </w:r>
@@ -10916,14 +11137,12 @@
         <w:rPr>
           <w:rFonts w:cs="Times New Roman"/>
           <w:szCs w:val="24"/>
-          <w:lang w:val="da-DK"/>
-        </w:rPr>
-      </w:pPr>
-      <w:r>
-        <w:rPr>
-          <w:rFonts w:cs="Times New Roman"/>
-          <w:szCs w:val="24"/>
-          <w:lang w:val="da-DK"/>
+        </w:rPr>
+      </w:pPr>
+      <w:r>
+        <w:rPr>
+          <w:rFonts w:cs="Times New Roman"/>
+          <w:szCs w:val="24"/>
         </w:rPr>
         <w:t>The final project repository will preserve evidence used to evaluate the security of the application, including:</w:t>
       </w:r>
@@ -10937,14 +11156,12 @@
         <w:rPr>
           <w:rFonts w:cs="Times New Roman"/>
           <w:szCs w:val="24"/>
-          <w:lang w:val="da-DK"/>
-        </w:rPr>
-      </w:pPr>
-      <w:r>
-        <w:rPr>
-          <w:rFonts w:cs="Times New Roman"/>
-          <w:szCs w:val="24"/>
-          <w:lang w:val="da-DK"/>
+        </w:rPr>
+      </w:pPr>
+      <w:r>
+        <w:rPr>
+          <w:rFonts w:cs="Times New Roman"/>
+          <w:szCs w:val="24"/>
         </w:rPr>
         <w:t>Git commit history.</w:t>
       </w:r>
@@ -10958,14 +11175,12 @@
         <w:rPr>
           <w:rFonts w:cs="Times New Roman"/>
           <w:szCs w:val="24"/>
-          <w:lang w:val="da-DK"/>
-        </w:rPr>
-      </w:pPr>
-      <w:r>
-        <w:rPr>
-          <w:rFonts w:cs="Times New Roman"/>
-          <w:szCs w:val="24"/>
-          <w:lang w:val="da-DK"/>
+        </w:rPr>
+      </w:pPr>
+      <w:r>
+        <w:rPr>
+          <w:rFonts w:cs="Times New Roman"/>
+          <w:szCs w:val="24"/>
         </w:rPr>
         <w:t>Source code for all three components.</w:t>
       </w:r>
@@ -10979,14 +11194,12 @@
         <w:rPr>
           <w:rFonts w:cs="Times New Roman"/>
           <w:szCs w:val="24"/>
-          <w:lang w:val="da-DK"/>
-        </w:rPr>
-      </w:pPr>
-      <w:r>
-        <w:rPr>
-          <w:rFonts w:cs="Times New Roman"/>
-          <w:szCs w:val="24"/>
-          <w:lang w:val="da-DK"/>
+        </w:rPr>
+      </w:pPr>
+      <w:r>
+        <w:rPr>
+          <w:rFonts w:cs="Times New Roman"/>
+          <w:szCs w:val="24"/>
         </w:rPr>
         <w:t>Helper package.</w:t>
       </w:r>
@@ -11000,14 +11213,12 @@
         <w:rPr>
           <w:rFonts w:cs="Times New Roman"/>
           <w:szCs w:val="24"/>
-          <w:lang w:val="da-DK"/>
-        </w:rPr>
-      </w:pPr>
-      <w:r>
-        <w:rPr>
-          <w:rFonts w:cs="Times New Roman"/>
-          <w:szCs w:val="24"/>
-          <w:lang w:val="da-DK"/>
+        </w:rPr>
+      </w:pPr>
+      <w:r>
+        <w:rPr>
+          <w:rFonts w:cs="Times New Roman"/>
+          <w:szCs w:val="24"/>
         </w:rPr>
         <w:t>Functional and authorization tests.</w:t>
       </w:r>
@@ -11021,14 +11232,12 @@
         <w:rPr>
           <w:rFonts w:cs="Times New Roman"/>
           <w:szCs w:val="24"/>
-          <w:lang w:val="da-DK"/>
-        </w:rPr>
-      </w:pPr>
-      <w:r>
-        <w:rPr>
-          <w:rFonts w:cs="Times New Roman"/>
-          <w:szCs w:val="24"/>
-          <w:lang w:val="da-DK"/>
+        </w:rPr>
+      </w:pPr>
+      <w:r>
+        <w:rPr>
+          <w:rFonts w:cs="Times New Roman"/>
+          <w:szCs w:val="24"/>
         </w:rPr>
         <w:t>Jenkins pipeline definition.</w:t>
       </w:r>
@@ -11042,14 +11251,12 @@
         <w:rPr>
           <w:rFonts w:cs="Times New Roman"/>
           <w:szCs w:val="24"/>
-          <w:lang w:val="da-DK"/>
-        </w:rPr>
-      </w:pPr>
-      <w:r>
-        <w:rPr>
-          <w:rFonts w:cs="Times New Roman"/>
-          <w:szCs w:val="24"/>
-          <w:lang w:val="da-DK"/>
+        </w:rPr>
+      </w:pPr>
+      <w:r>
+        <w:rPr>
+          <w:rFonts w:cs="Times New Roman"/>
+          <w:szCs w:val="24"/>
         </w:rPr>
         <w:t>Static-analysis and dependency-analysis results.</w:t>
       </w:r>
@@ -11063,14 +11270,12 @@
         <w:rPr>
           <w:rFonts w:cs="Times New Roman"/>
           <w:szCs w:val="24"/>
-          <w:lang w:val="da-DK"/>
-        </w:rPr>
-      </w:pPr>
-      <w:r>
-        <w:rPr>
-          <w:rFonts w:cs="Times New Roman"/>
-          <w:szCs w:val="24"/>
-          <w:lang w:val="da-DK"/>
+        </w:rPr>
+      </w:pPr>
+      <w:r>
+        <w:rPr>
+          <w:rFonts w:cs="Times New Roman"/>
+          <w:szCs w:val="24"/>
         </w:rPr>
         <w:t>Test results and relevant CI/CD artifacts.</w:t>
       </w:r>
@@ -11084,14 +11289,12 @@
         <w:rPr>
           <w:rFonts w:cs="Times New Roman"/>
           <w:szCs w:val="24"/>
-          <w:lang w:val="da-DK"/>
-        </w:rPr>
-      </w:pPr>
-      <w:r>
-        <w:rPr>
-          <w:rFonts w:cs="Times New Roman"/>
-          <w:szCs w:val="24"/>
-          <w:lang w:val="da-DK"/>
+        </w:rPr>
+      </w:pPr>
+      <w:r>
+        <w:rPr>
+          <w:rFonts w:cs="Times New Roman"/>
+          <w:szCs w:val="24"/>
         </w:rPr>
         <w:t>Architecture and threat-model documentation.</w:t>
       </w:r>
@@ -11105,14 +11308,12 @@
         <w:rPr>
           <w:rFonts w:cs="Times New Roman"/>
           <w:szCs w:val="24"/>
-          <w:lang w:val="da-DK"/>
-        </w:rPr>
-      </w:pPr>
-      <w:r>
-        <w:rPr>
-          <w:rFonts w:cs="Times New Roman"/>
-          <w:szCs w:val="24"/>
-          <w:lang w:val="da-DK"/>
+        </w:rPr>
+      </w:pPr>
+      <w:r>
+        <w:rPr>
+          <w:rFonts w:cs="Times New Roman"/>
+          <w:szCs w:val="24"/>
         </w:rPr>
         <w:t>Access-control matrix.</w:t>
       </w:r>
@@ -11126,14 +11327,12 @@
         <w:rPr>
           <w:rFonts w:cs="Times New Roman"/>
           <w:szCs w:val="24"/>
-          <w:lang w:val="da-DK"/>
-        </w:rPr>
-      </w:pPr>
-      <w:r>
-        <w:rPr>
-          <w:rFonts w:cs="Times New Roman"/>
-          <w:szCs w:val="24"/>
-          <w:lang w:val="da-DK"/>
+        </w:rPr>
+      </w:pPr>
+      <w:r>
+        <w:rPr>
+          <w:rFonts w:cs="Times New Roman"/>
+          <w:szCs w:val="24"/>
         </w:rPr>
         <w:t>Initial security lifecycle plan.</w:t>
       </w:r>
@@ -11143,14 +11342,12 @@
         <w:rPr>
           <w:rFonts w:cs="Times New Roman"/>
           <w:szCs w:val="24"/>
-          <w:lang w:val="da-DK"/>
-        </w:rPr>
-      </w:pPr>
-      <w:r>
-        <w:rPr>
-          <w:rFonts w:cs="Times New Roman"/>
-          <w:szCs w:val="24"/>
-          <w:lang w:val="da-DK"/>
+        </w:rPr>
+      </w:pPr>
+      <w:r>
+        <w:rPr>
+          <w:rFonts w:cs="Times New Roman"/>
+          <w:szCs w:val="24"/>
         </w:rPr>
         <w:t>The final report will reference relevant code, commits, tests, logs and gate results when supporting security claims.</w:t>
       </w:r>

</xml_diff>